<commit_message>
Pruefdurchlauf: P2 bestanden, Pruefgeraet benannt
P2 (Zahlen in der App gegen die Inhaltsdateien): bestanden. In der App
stehen 43 Lernabschnitte, aufgeteilt in 15, 22 und 6 je Sektion, dazu
1.108 Woerter, 12 Geschichten und 16 Abschnitte mit Grammatikkennzeichen.
Alle stimmen mit den Inhaltsdateien ueberein.

Geprueft wird auf einem Geraet mit Android 15. Das steht jetzt ueber der
Tabelle, zusammen mit dem Hinweis, dass die untere Grenze der Zielplattform
aus 2.4 damit noch NICHT nachgewiesen ist - dafuer ist P13 da, und der
braucht ein Geraet mit Android 7.0.

Drei von fuenfzehn Pruefungen sind durch: P1, P2, P12.

Co-Authored-By: Claude Opus 5 <noreply@anthropic.com>
</commit_message>
<xml_diff>
--- a/mappe/Zmaj Projektmappe.docx
+++ b/mappe/Zmaj Projektmappe.docx
@@ -17584,7 +17584,7 @@
                 <w:sz w:val="18"/>
                 <w:szCs w:val="18"/>
               </w:rPr>
-              <w:t xml:space="preserve">offen</w:t>
+              <w:t xml:space="preserve">bestanden 25.09.</w:t>
             </w:r>
           </w:p>
         </w:tc>
@@ -19568,7 +19568,7 @@
           <w:sz w:val="22"/>
           <w:szCs w:val="22"/>
         </w:rPr>
-        <w:t xml:space="preserve"> Am 25.09.2026 wurden P1 und P12 durchgeführt, beide bestanden. Bei P1 blieb der gesperrte Abschnitt gesperrt und wies auf den vorangegangenen hin. Bei P12 stimmte der eingelesene Lernstand mit dem Stand vor dem Löschen überein.</w:t>
+        <w:t xml:space="preserve"> Am 25.09.2026 wurden P1, P2 und P12 durchgeführt, alle drei bestanden. Bei P1 blieb der gesperrte Abschnitt gesperrt und wies auf den vorangegangenen hin. Bei P2 stimmten die in der App angezeigten Zahlen mit den Inhaltsdateien überein: 43 Lernabschnitte, aufgeteilt in 15, 22 und 6 je Sektion, 1.108 Wörter, 12 Geschichten und 16 Abschnitte mit Grammatikkennzeichen. Bei P12 stimmte der eingelesene Lernstand mit dem Stand vor dem Löschen überein.</w:t>
       </w:r>
     </w:p>
     <w:p>
@@ -19600,7 +19600,7 @@
           <w:sz w:val="22"/>
           <w:szCs w:val="22"/>
         </w:rPr>
-        <w:t xml:space="preserve">Die Spalte Ergebnis wird beim Durchlauf auf dem Gerät gefüllt. Dabei sind das Prüfdatum und die verwendete Android-Fassung mit anzugeben. P9 und P13 setzen ein zweites Gerät beziehungsweise ein abgeschlossenes Abonnement voraus und lassen sich erst nach der Freigabe der Produktionsversion durchführen.</w:t>
+        <w:t xml:space="preserve">Geprüft wird auf einem Gerät mit Android 15. Die Spalte Ergebnis trägt das Datum des Durchlaufs. Zwei Prüfungen lassen sich erst später durchführen: P9 setzt ein abgeschlossenes Abonnement voraus, P13 ein Gerät mit Android 7.0. Die untere Grenze der Zielplattform aus Abschnitt 2.4 ist deshalb noch nicht nachgewiesen.</w:t>
       </w:r>
     </w:p>
     <w:p>

</xml_diff>

<commit_message>
Projektmappe auf den Stand vom 01.10.; Werbezaehler nach oertlichem Tag
Mappe (Stand 02.10.2026, 34 Seiten):
- Lastenheft: 65 Lernabschnitte, 1.728 Vokabeln, neun Sektionen,
  Einstufung, Wiederholen, Erinnerungen, Bewertung, Festtage,
  Vollversion mit Schmuck und Geschenktagen.
- Konzept, Risiken, Durchfuehrung und Anhang nachgezogen, Zeiterfassung
  neu gerechnet (92,9 h an 19 Tagen), Bilder auf die acht Store-Bilder
  vom 01.10. umgestellt, Quelltextauszuege mit dem Quelltext abgeglichen,
  Seitenzahlen im Inhaltsverzeichnis neu.
- 5.7 (Auswertung des Tests) und der Abschluss von 5.4 bleiben bis nach
  dem 07.10.

App: Der Tageszaehler der Werbung nahm den UTC-Tag und sprang deshalb um
2 Uhr nachts um. Jetzt today(), wie ueberall sonst.

Co-Authored-By: Claude Opus 5.5 <noreply@anthropic.com>
</commit_message>
<xml_diff>
--- a/mappe/Zmaj Projektmappe.docx
+++ b/mappe/Zmaj Projektmappe.docx
@@ -246,7 +246,7 @@
           <w:sz w:val="20"/>
           <w:szCs w:val="20"/>
         </w:rPr>
-        <w:t xml:space="preserve">Stand: 26.09.2026</w:t>
+        <w:t xml:space="preserve">Stand: 02.10.2026</w:t>
       </w:r>
     </w:p>
     <w:p>
@@ -702,7 +702,7 @@
           <w:sz w:val="22"/>
           <w:szCs w:val="22"/>
         </w:rPr>
-        <w:t xml:space="preserve">	8</w:t>
+        <w:t xml:space="preserve">	9</w:t>
       </w:r>
     </w:p>
     <w:p>
@@ -745,7 +745,7 @@
           <w:sz w:val="22"/>
           <w:szCs w:val="22"/>
         </w:rPr>
-        <w:t xml:space="preserve">	8</w:t>
+        <w:t xml:space="preserve">	9</w:t>
       </w:r>
     </w:p>
     <w:p>
@@ -788,7 +788,7 @@
           <w:sz w:val="22"/>
           <w:szCs w:val="22"/>
         </w:rPr>
-        <w:t xml:space="preserve">	8</w:t>
+        <w:t xml:space="preserve">	9</w:t>
       </w:r>
     </w:p>
     <w:p>
@@ -831,7 +831,7 @@
           <w:sz w:val="22"/>
           <w:szCs w:val="22"/>
         </w:rPr>
-        <w:t xml:space="preserve">	9</w:t>
+        <w:t xml:space="preserve">	10</w:t>
       </w:r>
     </w:p>
     <w:p>
@@ -874,7 +874,7 @@
           <w:sz w:val="22"/>
           <w:szCs w:val="22"/>
         </w:rPr>
-        <w:t xml:space="preserve">	9</w:t>
+        <w:t xml:space="preserve">	10</w:t>
       </w:r>
     </w:p>
     <w:p>
@@ -917,7 +917,7 @@
           <w:sz w:val="22"/>
           <w:szCs w:val="22"/>
         </w:rPr>
-        <w:t xml:space="preserve">	9</w:t>
+        <w:t xml:space="preserve">	11</w:t>
       </w:r>
     </w:p>
     <w:p>
@@ -960,7 +960,7 @@
           <w:sz w:val="22"/>
           <w:szCs w:val="22"/>
         </w:rPr>
-        <w:t xml:space="preserve">	10</w:t>
+        <w:t xml:space="preserve">	11</w:t>
       </w:r>
     </w:p>
     <w:p>
@@ -1003,7 +1003,7 @@
           <w:sz w:val="22"/>
           <w:szCs w:val="22"/>
         </w:rPr>
-        <w:t xml:space="preserve">	11</w:t>
+        <w:t xml:space="preserve">	13</w:t>
       </w:r>
     </w:p>
     <w:p>
@@ -1046,7 +1046,7 @@
           <w:sz w:val="22"/>
           <w:szCs w:val="22"/>
         </w:rPr>
-        <w:t xml:space="preserve">	11</w:t>
+        <w:t xml:space="preserve">	13</w:t>
       </w:r>
     </w:p>
     <w:p>
@@ -1089,7 +1089,7 @@
           <w:sz w:val="22"/>
           <w:szCs w:val="22"/>
         </w:rPr>
-        <w:t xml:space="preserve">	11</w:t>
+        <w:t xml:space="preserve">	13</w:t>
       </w:r>
     </w:p>
     <w:p>
@@ -1132,7 +1132,7 @@
           <w:sz w:val="22"/>
           <w:szCs w:val="22"/>
         </w:rPr>
-        <w:t xml:space="preserve">	12</w:t>
+        <w:t xml:space="preserve">	15</w:t>
       </w:r>
     </w:p>
     <w:p>
@@ -1175,7 +1175,7 @@
           <w:sz w:val="22"/>
           <w:szCs w:val="22"/>
         </w:rPr>
-        <w:t xml:space="preserve">	13</w:t>
+        <w:t xml:space="preserve">	15</w:t>
       </w:r>
     </w:p>
     <w:p>
@@ -1218,7 +1218,7 @@
           <w:sz w:val="22"/>
           <w:szCs w:val="22"/>
         </w:rPr>
-        <w:t xml:space="preserve">	13</w:t>
+        <w:t xml:space="preserve">	16</w:t>
       </w:r>
     </w:p>
     <w:p>
@@ -1261,7 +1261,7 @@
           <w:sz w:val="22"/>
           <w:szCs w:val="22"/>
         </w:rPr>
-        <w:t xml:space="preserve">	14</w:t>
+        <w:t xml:space="preserve">	16</w:t>
       </w:r>
     </w:p>
     <w:p>
@@ -1304,7 +1304,7 @@
           <w:sz w:val="22"/>
           <w:szCs w:val="22"/>
         </w:rPr>
-        <w:t xml:space="preserve">	15</w:t>
+        <w:t xml:space="preserve">	18</w:t>
       </w:r>
     </w:p>
     <w:p>
@@ -1347,7 +1347,7 @@
           <w:sz w:val="22"/>
           <w:szCs w:val="22"/>
         </w:rPr>
-        <w:t xml:space="preserve">	15</w:t>
+        <w:t xml:space="preserve">	18</w:t>
       </w:r>
     </w:p>
     <w:p>
@@ -1390,7 +1390,7 @@
           <w:sz w:val="22"/>
           <w:szCs w:val="22"/>
         </w:rPr>
-        <w:t xml:space="preserve">	15</w:t>
+        <w:t xml:space="preserve">	18</w:t>
       </w:r>
     </w:p>
     <w:p>
@@ -1433,7 +1433,7 @@
           <w:sz w:val="22"/>
           <w:szCs w:val="22"/>
         </w:rPr>
-        <w:t xml:space="preserve">	16</w:t>
+        <w:t xml:space="preserve">	19</w:t>
       </w:r>
     </w:p>
     <w:p>
@@ -1476,7 +1476,7 @@
           <w:sz w:val="22"/>
           <w:szCs w:val="22"/>
         </w:rPr>
-        <w:t xml:space="preserve">	16</w:t>
+        <w:t xml:space="preserve">	20</w:t>
       </w:r>
     </w:p>
     <w:p>
@@ -1519,7 +1519,7 @@
           <w:sz w:val="22"/>
           <w:szCs w:val="22"/>
         </w:rPr>
-        <w:t xml:space="preserve">	17</w:t>
+        <w:t xml:space="preserve">	21</w:t>
       </w:r>
     </w:p>
     <w:p>
@@ -1562,7 +1562,7 @@
           <w:sz w:val="22"/>
           <w:szCs w:val="22"/>
         </w:rPr>
-        <w:t xml:space="preserve">	18</w:t>
+        <w:t xml:space="preserve">	22</w:t>
       </w:r>
     </w:p>
     <w:p>
@@ -1605,7 +1605,7 @@
           <w:sz w:val="22"/>
           <w:szCs w:val="22"/>
         </w:rPr>
-        <w:t xml:space="preserve">	20</w:t>
+        <w:t xml:space="preserve">	24</w:t>
       </w:r>
     </w:p>
     <w:p>
@@ -1648,7 +1648,7 @@
           <w:sz w:val="22"/>
           <w:szCs w:val="22"/>
         </w:rPr>
-        <w:t xml:space="preserve">	23</w:t>
+        <w:t xml:space="preserve">	28</w:t>
       </w:r>
     </w:p>
     <w:p>
@@ -1691,7 +1691,7 @@
           <w:sz w:val="22"/>
           <w:szCs w:val="22"/>
         </w:rPr>
-        <w:t xml:space="preserve">	23</w:t>
+        <w:t xml:space="preserve">	28</w:t>
       </w:r>
     </w:p>
     <w:p>
@@ -1734,7 +1734,7 @@
           <w:sz w:val="22"/>
           <w:szCs w:val="22"/>
         </w:rPr>
-        <w:t xml:space="preserve">	25</w:t>
+        <w:t xml:space="preserve">	30</w:t>
       </w:r>
     </w:p>
     <w:p>
@@ -1777,7 +1777,7 @@
           <w:sz w:val="22"/>
           <w:szCs w:val="22"/>
         </w:rPr>
-        <w:t xml:space="preserve">	26</w:t>
+        <w:t xml:space="preserve">	31</w:t>
       </w:r>
     </w:p>
     <w:p>
@@ -1820,7 +1820,7 @@
           <w:sz w:val="22"/>
           <w:szCs w:val="22"/>
         </w:rPr>
-        <w:t xml:space="preserve">	27</w:t>
+        <w:t xml:space="preserve">	32</w:t>
       </w:r>
     </w:p>
     <w:p>
@@ -2096,7 +2096,7 @@
           <w:sz w:val="22"/>
           <w:szCs w:val="22"/>
         </w:rPr>
-        <w:t xml:space="preserve">Die App finanziert sich über Werbung. Eine Vollversion ohne Werbung und ohne Begrenzung der täglichen Versuche wird als Abonnement angeboten: 2,99 Euro im Monat oder 19,99 Euro im Jahr, jeweils einschließlich Umsatzsteuer. Damit ist das Jahresabonnement um rund 44 Prozent günstiger. Der Lernstoff ist in beiden Fassungen vollständig zugänglich, sodass sich die Zahlung allein auf die Werbefreiheit und die unbegrenzten Versuche bezieht und nicht auf den Zugang zum Lernmaterial.</w:t>
+        <w:t xml:space="preserve">Die App finanziert sich über Werbung. Eine Vollversion ohne Werbung und ohne Begrenzung der täglichen Versuche wird als Abonnement angeboten: 2,99 Euro im Monat oder 19,99 Euro im Jahr, jeweils einschließlich Umsatzsteuer. Damit ist das Jahresabonnement um rund 44 Prozent günstiger. Der Lernstoff ist in beiden Fassungen vollständig zugänglich, sodass sich die Zahlung auf die Werbefreiheit, die unbegrenzten Versuche und acht zusätzliche Ausstattungsteile für das Maskottchen bezieht und nicht auf den Zugang zum Lernmaterial. Nach jedem vollen Jahr seit dem ersten Start schaltet die App die Vollversion außerdem für fünf Tage kostenlos frei.</w:t>
       </w:r>
     </w:p>
     <w:p>
@@ -2112,7 +2112,7 @@
           <w:sz w:val="22"/>
           <w:szCs w:val="22"/>
         </w:rPr>
-        <w:t xml:space="preserve">Auftraggeber und Auftragnehmer fallen zusammen, da die App aus eigenem Bedarf und nicht im Auftrag eines Dritten entsteht. Die Anforderungen dieses Lastenhefts sind daher selbst gesetzt. Schriftlich zusammengefasst wurden sie am 24.09.2026, also nach Fertigstellung der App. Die Festlegungen selbst sind älter und in der Versionsverwaltung mit Datum belegt, wie Abschnitt 5.6 ausweist. Verbindlich vorgegeben sind allein die Bedingungen des Vertriebs, die in Abschnitt 2.4 aufgeführt sind.</w:t>
+        <w:t xml:space="preserve">Auftraggeber und Auftragnehmer fallen zusammen, da die App aus eigenem Bedarf und nicht im Auftrag eines Dritten entsteht. Die Anforderungen dieses Lastenhefts sind daher selbst gesetzt. Schriftlich zusammengefasst wurden sie am 24.09.2026, also nach Fertigstellung der App. Die Festlegungen selbst sind älter und in der Versionsverwaltung mit Datum belegt, wie Abschnitt 5.6 ausweist. Nachgetragen sind die Erweiterungen der App bis zum 01.10.2026. Drei davon gehen auf Vorschläge von Testpersonen aus dem geschlossenen Test zurück, nämlich der Einstufungstest, der Reiter „Wiederholen“ und zwei Lernabschnitte mit technischem Alltagswortschatz. Verbindlich vorgegeben sind allein die Bedingungen des Vertriebs, die in Abschnitt 2.4 aufgeführt sind.</w:t>
       </w:r>
     </w:p>
     <w:p>
@@ -2316,7 +2316,7 @@
           <w:sz w:val="22"/>
           <w:szCs w:val="22"/>
         </w:rPr>
-        <w:t xml:space="preserve">Die App stellt den Lernstoff in drei Abschnitten bereit: Grundlagen und Alltag, Grammatik, sowie Leben und Arbeiten. Der Aufbau ist linear, sodass ein Abschnitt erst dann freigeschaltet wird, wenn der vorangegangene bestanden ist.</w:t>
+        <w:t xml:space="preserve">Die App stellt den Lernstoff in neun Sektionen bereit, die von leicht nach schwer geordnet sind: Grundlagen und Alltag, Dinge zum Anfassen, Tiere und Natur, Zuhause, Sätze bauen, Einkaufen und Essen gehen, Bosnien und Herkunft, Menschen und Kultur sowie Amt und Verträge. Der Aufbau ist linear, sodass ein Lernabschnitt erst dann freigeschaltet wird, wenn der vorangegangene bestanden ist. Ausgenommen sind die Lernabschnitte, die der Einstufungstest beim ersten Start freigibt.</w:t>
       </w:r>
     </w:p>
     <w:p>
@@ -2332,7 +2332,7 @@
           <w:sz w:val="22"/>
           <w:szCs w:val="22"/>
         </w:rPr>
-        <w:t xml:space="preserve">Der Umfang beträgt 43 Lernabschnitte mit 1.108 Vokabeln, 16 Grammatikeinheiten mit 104 Übungen und 12 Lesegeschichten. Zu jeder Vokabel gehört eine bosnische Sprachaufnahme.</w:t>
+        <w:t xml:space="preserve">Der Umfang beträgt 65 Lernabschnitte mit 1.728 Vokabeln und 300 Lückensätzen, 16 Grammatikeinheiten mit 104 Übungen und 12 Lesegeschichten. Zu jeder Vokabel gehört eine bosnische Sprachaufnahme.</w:t>
       </w:r>
     </w:p>
     <w:p>
@@ -2343,12 +2343,22 @@
       <w:r>
         <w:rPr>
           <w:rFonts w:ascii="Calibri" w:cs="Calibri" w:eastAsia="Calibri" w:hAnsi="Calibri"/>
+          <w:b/>
+          <w:bCs/>
+          <w:sz w:val="22"/>
+          <w:szCs w:val="22"/>
+        </w:rPr>
+        <w:t xml:space="preserve">Einstufung.</w:t>
+      </w:r>
+      <w:r>
+        <w:rPr>
+          <w:rFonts w:ascii="Calibri" w:cs="Calibri" w:eastAsia="Calibri" w:hAnsi="Calibri"/>
           <w:b w:val="false"/>
           <w:bCs w:val="false"/>
           <w:sz w:val="22"/>
           <w:szCs w:val="22"/>
         </w:rPr>
-        <w:t xml:space="preserve">Geübt wird in fünf Formen: Hören, Schreiben, Auswählen, Lückentexte und Sprechen. Dabei erfolgt die Auswertung der Aussprache in der Sprechaufgabe über die Spracherkennung des Geräts.</w:t>
+        <w:t xml:space="preserve"> Beim ersten Start fragt die App, ob bereits Bosnischkenntnisse vorhanden sind. Wer das bejaht, kann einen Test mit 15 Fragen in fünf Stufen von leicht bis schwer ablegen, der keine Leben verbraucht. Der Einstieg liegt dann hinter der letzten Stufe, bis zu der mindestens 80 Prozent aller Antworten stimmen. Die Lernabschnitte davor sind offen, gelten aber nicht als bestanden. Die Sektion Amt und Verträge wird dabei nie übersprungen.</w:t>
       </w:r>
     </w:p>
     <w:p>
@@ -2359,6 +2369,22 @@
       <w:r>
         <w:rPr>
           <w:rFonts w:ascii="Calibri" w:cs="Calibri" w:eastAsia="Calibri" w:hAnsi="Calibri"/>
+          <w:b w:val="false"/>
+          <w:bCs w:val="false"/>
+          <w:sz w:val="22"/>
+          <w:szCs w:val="22"/>
+        </w:rPr>
+        <w:t xml:space="preserve">Geübt wird in fünf Formen: Hören, Schreiben, Auswählen, Lückentexte und Sprechen. Dabei erfolgt die Auswertung der Aussprache in der Sprechaufgabe über die Spracherkennung des Geräts.</w:t>
+      </w:r>
+    </w:p>
+    <w:p>
+      <w:pPr>
+        <w:spacing w:after="160" w:line="276"/>
+        <w:jc w:val="both"/>
+      </w:pPr>
+      <w:r>
+        <w:rPr>
+          <w:rFonts w:ascii="Calibri" w:cs="Calibri" w:eastAsia="Calibri" w:hAnsi="Calibri"/>
           <w:b/>
           <w:bCs/>
           <w:sz w:val="22"/>
@@ -2374,7 +2400,7 @@
           <w:sz w:val="22"/>
           <w:szCs w:val="22"/>
         </w:rPr>
-        <w:t xml:space="preserve"> Falsch beantwortete Aufgaben werden erneut vorgelegt. Zusätzlich hält der Lernstand fest, welche Wörter sicher beherrscht werden, sodass diese seltener erscheinen.</w:t>
+        <w:t xml:space="preserve"> Falsch beantwortete Aufgaben werden erneut vorgelegt. Zusätzlich hält der Lernstand fest, welche Wörter sicher beherrscht werden, sodass diese seltener erscheinen. Dazu sammelt ein eigener Reiter „Wiederholen“ die Fehler aus Lektionen und Abschlusstests und legt sie in Runden zu zehn Aufgaben vor. Eine Aufgabe scheidet aus, sobald sie zweimal hintereinander richtig beantwortet wurde. Eine Runde zählt wie eine Lektion und steht auch ohne Vollversion offen.</w:t>
       </w:r>
     </w:p>
     <w:p>
@@ -2426,7 +2452,7 @@
           <w:sz w:val="22"/>
           <w:szCs w:val="22"/>
         </w:rPr>
-        <w:t xml:space="preserve"> Erfüllte Tagesaufgaben bringen je zehn Münzen. Täglich werden drei Aufgaben aus neun Arten gezogen, darunter eine Anzahl richtiger Antworten, eine gelesene Geschichte oder eine Lernzeit in Minuten. Im Laden lassen sich dafür zwei Dinge erwerben. Zum einen Ausstattung für das Maskottchen, derzeit sechzehn Teile in den Gruppen Farbe, Brille, Hals und Kopf. Zum anderen das sofortige Auffüllen eines Lebens und der Serienschutz.</w:t>
+        <w:t xml:space="preserve"> Erfüllte Tagesaufgaben bringen je zehn Münzen. Täglich werden drei Aufgaben aus neun Arten gezogen, darunter eine Anzahl richtiger Antworten, eine gelesene Geschichte oder eine Lernzeit in Minuten. Im Laden lassen sich dafür zwei Dinge erwerben. Zum einen Ausstattung für das Maskottchen, derzeit zwanzig Teile in den Gruppen Farbe, Brille, Hals und Kopf. Zum anderen das sofortige Auffüllen eines Lebens und der Serienschutz. Acht weitere Teile, darunter eine große Krone, vier Drachenfarben und ein Funkeln, lassen sich nicht kaufen und stehen nur in der Vollversion zur Verfügung.</w:t>
       </w:r>
     </w:p>
     <w:p>
@@ -2442,7 +2468,7 @@
           <w:sz w:val="22"/>
           <w:szCs w:val="22"/>
         </w:rPr>
-        <w:t xml:space="preserve">Lernserie und Serienschutz.</w:t>
+        <w:t xml:space="preserve">Festtage.</w:t>
       </w:r>
       <w:r>
         <w:rPr>
@@ -2452,7 +2478,7 @@
           <w:sz w:val="22"/>
           <w:szCs w:val="22"/>
         </w:rPr>
-        <w:t xml:space="preserve"> Die App zählt die zusammenhängenden Lerntage. Nach zehn Tagen entsteht ein Schutz, der einen versäumten Tag auffängt, ohne dass die Serie endet. Höchstens zwei solcher Schutztage lassen sich gleichzeitig halten. Erreichte Lerntage werden als Wegmarken gefeiert.</w:t>
+        <w:t xml:space="preserve"> Zu Weihnachten, zu Ostern sowie zum Ramazanski und zum Kurban Bajram trägt das Maskottchen von selbst ein kostenloses Festkostüm. Die Startseite zeigt in dieser Zeit Schmuck und einen Gruß auf Bosnisch. Da sich die Termine des Bajram nicht wie Ostern berechnen lassen, stehen sie in einer Tabelle, die bis 2036 reicht. Ab 2027 kommt Halloween hinzu.</w:t>
       </w:r>
     </w:p>
     <w:p>
@@ -2468,7 +2494,7 @@
           <w:sz w:val="22"/>
           <w:szCs w:val="22"/>
         </w:rPr>
-        <w:t xml:space="preserve">Bedienoberfläche.</w:t>
+        <w:t xml:space="preserve">Lernserie und Serienschutz.</w:t>
       </w:r>
       <w:r>
         <w:rPr>
@@ -2478,7 +2504,7 @@
           <w:sz w:val="22"/>
           <w:szCs w:val="22"/>
         </w:rPr>
-        <w:t xml:space="preserve"> Die App liegt in acht Sprachen vor: Deutsch, Englisch, Türkisch, Schwedisch, Niederländisch, Norwegisch, Dänisch und Französisch. Dabei sind je Sprache 396 Texte zu pflegen. Die Auswahl der Sprachen richtet sich nach den Ländern, in denen die bosnische Diaspora vorwiegend lebt.</w:t>
+        <w:t xml:space="preserve"> Die App zählt die zusammenhängenden Lerntage. Nach zehn Tagen entsteht ein Schutz, der einen versäumten Tag auffängt, ohne dass die Serie endet. Höchstens zwei solcher Schutztage lassen sich gleichzeitig halten. Erreichte Lerntage werden als Wegmarken gefeiert.</w:t>
       </w:r>
     </w:p>
     <w:p>
@@ -2494,7 +2520,7 @@
           <w:sz w:val="22"/>
           <w:szCs w:val="22"/>
         </w:rPr>
-        <w:t xml:space="preserve">Betrieb ohne Server.</w:t>
+        <w:t xml:space="preserve">Erinnerungen.</w:t>
       </w:r>
       <w:r>
         <w:rPr>
@@ -2504,7 +2530,85 @@
           <w:sz w:val="22"/>
           <w:szCs w:val="22"/>
         </w:rPr>
+        <w:t xml:space="preserve"> Nach der ersten Lektion fragt die App, ob sie erinnern darf. Am Abend kommt dann höchstens eine Nachricht, entweder um 19 Uhr eine Erinnerung, falls an diesem Tag noch keine Lektion gemacht wurde, oder um 20 Uhr eine Warnung, bevor die Lernserie reißt. Liegt ein Serienschutz bereit, kommt statt der Warnung die Erinnerung. Dazu meldet die App, wenn die Leben nach dem Aufbrauchen wieder voll sind. Jede der drei Arten lässt sich in den Einstellungen einzeln abschalten. Geplant werden die Nachrichten auf dem Gerät selbst, sodass auch dafür kein Server nötig ist.</w:t>
+      </w:r>
+    </w:p>
+    <w:p>
+      <w:pPr>
+        <w:spacing w:after="160" w:line="276"/>
+        <w:jc w:val="both"/>
+      </w:pPr>
+      <w:r>
+        <w:rPr>
+          <w:rFonts w:ascii="Calibri" w:cs="Calibri" w:eastAsia="Calibri" w:hAnsi="Calibri"/>
+          <w:b/>
+          <w:bCs/>
+          <w:sz w:val="22"/>
+          <w:szCs w:val="22"/>
+        </w:rPr>
+        <w:t xml:space="preserve">Bedienoberfläche.</w:t>
+      </w:r>
+      <w:r>
+        <w:rPr>
+          <w:rFonts w:ascii="Calibri" w:cs="Calibri" w:eastAsia="Calibri" w:hAnsi="Calibri"/>
+          <w:b w:val="false"/>
+          <w:bCs w:val="false"/>
+          <w:sz w:val="22"/>
+          <w:szCs w:val="22"/>
+        </w:rPr>
+        <w:t xml:space="preserve"> Die App liegt in acht Sprachen vor: Deutsch, Englisch, Türkisch, Schwedisch, Niederländisch, Norwegisch, Dänisch und Französisch. Dabei sind je Sprache 488 Texte zu pflegen. Die Auswahl der Sprachen richtet sich nach den Ländern, in denen die bosnische Diaspora vorwiegend lebt.</w:t>
+      </w:r>
+    </w:p>
+    <w:p>
+      <w:pPr>
+        <w:spacing w:after="160" w:line="276"/>
+        <w:jc w:val="both"/>
+      </w:pPr>
+      <w:r>
+        <w:rPr>
+          <w:rFonts w:ascii="Calibri" w:cs="Calibri" w:eastAsia="Calibri" w:hAnsi="Calibri"/>
+          <w:b/>
+          <w:bCs/>
+          <w:sz w:val="22"/>
+          <w:szCs w:val="22"/>
+        </w:rPr>
+        <w:t xml:space="preserve">Betrieb ohne Server.</w:t>
+      </w:r>
+      <w:r>
+        <w:rPr>
+          <w:rFonts w:ascii="Calibri" w:cs="Calibri" w:eastAsia="Calibri" w:hAnsi="Calibri"/>
+          <w:b w:val="false"/>
+          <w:bCs w:val="false"/>
+          <w:sz w:val="22"/>
+          <w:szCs w:val="22"/>
+        </w:rPr>
         <w:t xml:space="preserve"> Die App arbeitet vollständig auf dem Gerät, ein Nutzerkonto und eine Anmeldung sind nicht vorgesehen. Die Speicherung des Lernstands erfolgt im Gerätespeicher, sodass die Daten das Telefon nicht verlassen. Zusätzlich lässt sich auf Wunsch eine Sicherungsdatei erzeugen und wieder einlesen.</w:t>
+      </w:r>
+    </w:p>
+    <w:p>
+      <w:pPr>
+        <w:spacing w:after="160" w:line="276"/>
+        <w:jc w:val="both"/>
+      </w:pPr>
+      <w:r>
+        <w:rPr>
+          <w:rFonts w:ascii="Calibri" w:cs="Calibri" w:eastAsia="Calibri" w:hAnsi="Calibri"/>
+          <w:b/>
+          <w:bCs/>
+          <w:sz w:val="22"/>
+          <w:szCs w:val="22"/>
+        </w:rPr>
+        <w:t xml:space="preserve">Bewertung.</w:t>
+      </w:r>
+      <w:r>
+        <w:rPr>
+          <w:rFonts w:ascii="Calibri" w:cs="Calibri" w:eastAsia="Calibri" w:hAnsi="Calibri"/>
+          <w:b w:val="false"/>
+          <w:bCs w:val="false"/>
+          <w:sz w:val="22"/>
+          <w:szCs w:val="22"/>
+        </w:rPr>
+        <w:t xml:space="preserve"> Nach einem bestandenen Lernabschnitt bittet die App um eine Bewertung bei Google Play, frühestens am dritten Lerntag und höchstens zweimal im Jahr. Ein zweiter Knopf führt zu einem Feld, in dem sich eine Verbesserung vorschlagen lässt. Eine Vorabfrage, ob die App gefällt, gibt es nicht, da Googles Vorgaben für die Bewertungsabfrage das ausschließen. Nach „Nein danke“ fragt die App nicht wieder.</w:t>
       </w:r>
     </w:p>
     <w:p>
@@ -2590,7 +2694,7 @@
           <w:sz w:val="22"/>
           <w:szCs w:val="22"/>
         </w:rPr>
-        <w:t xml:space="preserve"> Die App fordert drei Berechtigungen an: Internetzugang für die Werbeauslieferung und die Abonnementprüfung, Mikrofonzugriff für die Sprechaufgabe sowie Vibration für die Rückmeldung bei falschen Antworten. Weitere Berechtigungen werden nicht angefordert.</w:t>
+        <w:t xml:space="preserve"> Die App fordert vier Berechtigungen an: Internetzugang für die Werbeauslieferung und die Abonnementprüfung, Mikrofonzugriff für die Sprechaufgabe, Vibration für die Rückmeldung bei falschen Antworten sowie Benachrichtigungen für die Erinnerungen. Weitere Einträge, etwa für die Werbekennung und die Abrechnung über Google Play, bringen die eingebundenen Bibliotheken selbst mit. Die Berechtigung für exakte Wecker, die das Modul für Benachrichtigungen zusätzlich anmeldet, ist entfernt, da eine ungefähre Uhrzeit genügt.</w:t>
       </w:r>
     </w:p>
     <w:p>
@@ -2616,7 +2720,7 @@
           <w:sz w:val="22"/>
           <w:szCs w:val="22"/>
         </w:rPr>
-        <w:t xml:space="preserve"> Für die Abonnementabwicklung und für die Einwilligungsabfrage nach europäischem Datenschutzrecht wurden zwei eigene Java-Klassen erstellt, da die verfügbaren Fremdbibliotheken die benötigten Abläufe nicht vollständig abdeckten.</w:t>
+        <w:t xml:space="preserve"> Für die Abonnementabwicklung und für die Einwilligungsabfrage nach europäischem Datenschutzrecht wurden zwei eigene Java-Klassen erstellt, da die verfügbaren Fremdbibliotheken die benötigten Abläufe nicht vollständig abdeckten. Seit dem 01.10.2026 ruft eine dritte Klasse das Bewertungsfenster von Google Play auf. Da Google nicht zurückmeldet, ob das Fenster erschienen ist, misst sie die Zeit bis zur Antwort. Kommt diese nach weniger als anderthalb Sekunden, öffnet sich stattdessen die Seite von Zmaj im Play Store.</w:t>
       </w:r>
     </w:p>
     <w:p>
@@ -2782,7 +2886,7 @@
           <w:sz w:val="22"/>
           <w:szCs w:val="22"/>
         </w:rPr>
-        <w:t xml:space="preserve">Sprachsynthese für 1.108 Sprachaufnahmen: 0,00 Euro (kostenloses Kontingent des Anbieters)</w:t>
+        <w:t xml:space="preserve">Sprachsynthese für 2.332 Sprachaufnahmen: 0,00 Euro (kostenloses Kontingent des Anbieters)</w:t>
       </w:r>
     </w:p>
     <w:p>
@@ -3085,7 +3189,7 @@
           <w:sz w:val="22"/>
           <w:szCs w:val="22"/>
         </w:rPr>
-        <w:t xml:space="preserve">Die Entscheidung vom 14.09.2026 machte einen Umbau nötig, bei dem Anmeldung, Kontoverwaltung und Sitzungsverwaltung aus der ausgelieferten App entfernt wurden. Ein Rest davon blieb als Werkzeug zum Testen am Rechner erhalten. Der Umbau wird in Abschnitt 5.1 beschrieben.</w:t>
+        <w:t xml:space="preserve">Die Entscheidung vom 14.09.2026 machte einen Umbau nötig, bei dem Anmeldung, Kontoverwaltung und Sitzungsverwaltung aus der ausgelieferten App entfernt wurden. Ein Rest davon blieb im Quelltext erhalten. Seit dem 26.09.2026 ist er auch am Rechner über einen Schalter abgeschaltet, sodass sich die App dort wie auf dem Gerät verhält. Der Umbau wird in Abschnitt 5.1 beschrieben.</w:t>
       </w:r>
     </w:p>
     <w:p>
@@ -3101,7 +3205,7 @@
           <w:sz w:val="22"/>
           <w:szCs w:val="22"/>
         </w:rPr>
-        <w:t xml:space="preserve">Folge für den Datenschutz.</w:t>
+        <w:t xml:space="preserve">Androids eigene Sicherung bleibt zugelassen.</w:t>
       </w:r>
       <w:r>
         <w:rPr>
@@ -3111,7 +3215,59 @@
           <w:sz w:val="22"/>
           <w:szCs w:val="22"/>
         </w:rPr>
-        <w:t xml:space="preserve"> Ohne Konto entstehen keine Anmeldedaten, und der Lernstand verlässt das Gerät nicht. Eine Verbindung nach außen bleibt dennoch bestehen, weil Werbeauslieferung und Abonnementprüfung mit Google kommunizieren, wie die Berechtigungen in Abschnitt 2.4 ausweisen. Die Datenschutzerklärung führt deshalb die Werbeeinbindung auf, jedoch kein Nutzerkonto und keine Übertragung des Lernstands.</w:t>
+        <w:t xml:space="preserve"> Am 19.09.2026 wurde entschieden, sie in der Android-Hülle nicht abzuschalten. Hat der Nutzer sie in seinem Google-Konto eingeschaltet, nimmt Android die Daten der App dorthin mit, sodass der Lernstand einen Gerätewechsel übersteht. Ausgenommen ist die gespeicherte Antwort zur Werbeeinwilligung, da sie auf einem neuen Gerät neu abgefragt wird.</w:t>
+      </w:r>
+    </w:p>
+    <w:p>
+      <w:pPr>
+        <w:spacing w:after="160" w:line="276"/>
+        <w:jc w:val="both"/>
+      </w:pPr>
+      <w:r>
+        <w:rPr>
+          <w:rFonts w:ascii="Calibri" w:cs="Calibri" w:eastAsia="Calibri" w:hAnsi="Calibri"/>
+          <w:b/>
+          <w:bCs/>
+          <w:sz w:val="22"/>
+          <w:szCs w:val="22"/>
+        </w:rPr>
+        <w:t xml:space="preserve">Folge für den Datenschutz.</w:t>
+      </w:r>
+      <w:r>
+        <w:rPr>
+          <w:rFonts w:ascii="Calibri" w:cs="Calibri" w:eastAsia="Calibri" w:hAnsi="Calibri"/>
+          <w:b w:val="false"/>
+          <w:bCs w:val="false"/>
+          <w:sz w:val="22"/>
+          <w:szCs w:val="22"/>
+        </w:rPr>
+        <w:t xml:space="preserve"> Ohne Konto entstehen keine Anmeldedaten, und die App selbst überträgt den Lernstand nicht. Eine Verbindung nach außen bleibt dennoch bestehen, weil Werbeauslieferung und Abonnementprüfung mit Google kommunizieren, wie die Berechtigungen in Abschnitt 2.4 ausweisen. Die Datenschutzerklärung führt deshalb die Werbeeinbindung und seit dem 01.10.2026 auch Androids eigene Sicherung auf, jedoch kein Nutzerkonto und keine Übertragung des Lernstands durch die App.</w:t>
+      </w:r>
+    </w:p>
+    <w:p>
+      <w:pPr>
+        <w:spacing w:after="160" w:line="276"/>
+        <w:jc w:val="both"/>
+      </w:pPr>
+      <w:r>
+        <w:rPr>
+          <w:rFonts w:ascii="Calibri" w:cs="Calibri" w:eastAsia="Calibri" w:hAnsi="Calibri"/>
+          <w:b/>
+          <w:bCs/>
+          <w:sz w:val="22"/>
+          <w:szCs w:val="22"/>
+        </w:rPr>
+        <w:t xml:space="preserve">Folge für die Erinnerungen.</w:t>
+      </w:r>
+      <w:r>
+        <w:rPr>
+          <w:rFonts w:ascii="Calibri" w:cs="Calibri" w:eastAsia="Calibri" w:hAnsi="Calibri"/>
+          <w:b w:val="false"/>
+          <w:bCs w:val="false"/>
+          <w:sz w:val="22"/>
+          <w:szCs w:val="22"/>
+        </w:rPr>
+        <w:t xml:space="preserve"> Die Erinnerungen am Abend, die am 01.10.2026 hinzukamen, plant die App auf dem Gerät selbst über das Plugin für lokale Benachrichtigungen. Ein Versand von außen schied aus, weil er einen Server vorausgesetzt hätte. Die Berechtigung für minutengenaue Wecker, die das Plugin mitbringt, ist entfernt, da es auf einige Minuten nicht ankommt.</w:t>
       </w:r>
     </w:p>
     <w:p>
@@ -3207,7 +3363,7 @@
           <w:sz w:val="22"/>
           <w:szCs w:val="22"/>
         </w:rPr>
-        <w:t xml:space="preserve"> Bezahlt werden ausschließlich Werbefreiheit und unbegrenzte Versuche, während der Zugang zum Lernstoff offen bleibt. Daraus ergibt sich die steuerliche Einordnung des Abonnements als Dienstleistung, die Abschnitt 2.4 nennt.</w:t>
+        <w:t xml:space="preserve"> Bezahlt werden Werbefreiheit, unbegrenzte Versuche und seit dem 29.09.2026 acht Ausstattungsteile für das Maskottchen, während der Zugang zum Lernstoff offen bleibt. Dazu gehören eine große Krone und vier Drachenfarben. Alle acht verändern nur das Aussehen und erleichtern keine Aufgabe. Daraus ergibt sich die steuerliche Einordnung des Abonnements als Dienstleistung, die Abschnitt 2.4 nennt.</w:t>
       </w:r>
     </w:p>
     <w:p>
@@ -3234,6 +3390,32 @@
           <w:szCs w:val="22"/>
         </w:rPr>
         <w:t xml:space="preserve"> Dienste wie RevenueCat prüfen Abonnements auf ihren eigenen Servern, was der Entscheidung aus Abschnitt 3.2, ohne Server auszukommen, widersprochen hätte. Stattdessen wurde ein eigenes Plugin entwickelt, das unmittelbar mit der Abrechnung des Play Store kommuniziert.</w:t>
+      </w:r>
+    </w:p>
+    <w:p>
+      <w:pPr>
+        <w:spacing w:after="160" w:line="276"/>
+        <w:jc w:val="both"/>
+      </w:pPr>
+      <w:r>
+        <w:rPr>
+          <w:rFonts w:ascii="Calibri" w:cs="Calibri" w:eastAsia="Calibri" w:hAnsi="Calibri"/>
+          <w:b/>
+          <w:bCs/>
+          <w:sz w:val="22"/>
+          <w:szCs w:val="22"/>
+        </w:rPr>
+        <w:t xml:space="preserve">Häufigkeit der Werbung.</w:t>
+      </w:r>
+      <w:r>
+        <w:rPr>
+          <w:rFonts w:ascii="Calibri" w:cs="Calibri" w:eastAsia="Calibri" w:hAnsi="Calibri"/>
+          <w:b w:val="false"/>
+          <w:bCs w:val="false"/>
+          <w:sz w:val="22"/>
+          <w:szCs w:val="22"/>
+        </w:rPr>
+        <w:t xml:space="preserve"> Seit dem 27.09.2026 folgt auf jede Lektion und jeden Test am Ende eines Lernabschnitts eine Anzeige, ohne Obergrenze für den Tag. Zuvor kam nur nach jeder dritten Lektion eine, höchstens sechs am Tag. Begrenzt bleibt das freiwillige Video für ein Leben, und zwar auf sechs am Tag, da sich die Wartezeit aus Abschnitt 3.4 sonst durch Videos umgehen ließe.</w:t>
       </w:r>
     </w:p>
     <w:p>
@@ -3324,6 +3506,58 @@
     </w:p>
     <w:p>
       <w:pPr>
+        <w:spacing w:after="160" w:line="276"/>
+        <w:jc w:val="both"/>
+      </w:pPr>
+      <w:r>
+        <w:rPr>
+          <w:rFonts w:ascii="Calibri" w:cs="Calibri" w:eastAsia="Calibri" w:hAnsi="Calibri"/>
+          <w:b/>
+          <w:bCs/>
+          <w:sz w:val="22"/>
+          <w:szCs w:val="22"/>
+        </w:rPr>
+        <w:t xml:space="preserve">Gewählt: Freigabe des Abschnittstests erst bei 100 Prozent.</w:t>
+      </w:r>
+      <w:r>
+        <w:rPr>
+          <w:rFonts w:ascii="Calibri" w:cs="Calibri" w:eastAsia="Calibri" w:hAnsi="Calibri"/>
+          <w:b w:val="false"/>
+          <w:bCs w:val="false"/>
+          <w:sz w:val="22"/>
+          <w:szCs w:val="22"/>
+        </w:rPr>
+        <w:t xml:space="preserve"> Seit dem 27.09.2026 öffnet sich der Test erst, wenn jedes Wort des Lernabschnitts einmal richtig beantwortet wurde. Zuvor öffnete er sich bei 80 Prozent der Wörter, sodass ein Abschnitt mit Lücken abgeschlossen werden konnte. Nach der Rechnung vom selben Tag braucht der Kurs dadurch rund ein Fünftel mehr Lektionen.</w:t>
+      </w:r>
+    </w:p>
+    <w:p>
+      <w:pPr>
+        <w:spacing w:after="160" w:line="276"/>
+        <w:jc w:val="both"/>
+      </w:pPr>
+      <w:r>
+        <w:rPr>
+          <w:rFonts w:ascii="Calibri" w:cs="Calibri" w:eastAsia="Calibri" w:hAnsi="Calibri"/>
+          <w:b/>
+          <w:bCs/>
+          <w:sz w:val="22"/>
+          <w:szCs w:val="22"/>
+        </w:rPr>
+        <w:t xml:space="preserve">Gewählt: Einstufungstest und Reiter zum Wiederholen.</w:t>
+      </w:r>
+      <w:r>
+        <w:rPr>
+          <w:rFonts w:ascii="Calibri" w:cs="Calibri" w:eastAsia="Calibri" w:hAnsi="Calibri"/>
+          <w:b w:val="false"/>
+          <w:bCs w:val="false"/>
+          <w:sz w:val="22"/>
+          <w:szCs w:val="22"/>
+        </w:rPr>
+        <w:t xml:space="preserve"> Beide gehen auf Vorschläge der Tester vom 24.09.2026 zurück und wurden am 30.09.2026 eingebaut. Beim ersten Start fragt die App nach Vorkenntnissen. Wer welche angibt, durchläuft einen Test mit 15 Fragen in fünf Stufen nach dem Vorbild von Duolingo und Busuu, der den Einstieg in den Lernpfad festlegt und keine Leben kostet. Falsch beantwortete Aufgaben sammeln sich in einem eigenen Reiter und werden in Runden zu zehn geübt, bis sie zweimal hintereinander richtig sind.</w:t>
+      </w:r>
+    </w:p>
+    <w:p>
+      <w:pPr>
         <w:pStyle w:val="Heading2"/>
         <w:keepNext/>
         <w:spacing w:after="140" w:before="280"/>
@@ -3410,6 +3644,58 @@
     </w:p>
     <w:p>
       <w:pPr>
+        <w:spacing w:after="160" w:line="276"/>
+        <w:jc w:val="both"/>
+      </w:pPr>
+      <w:r>
+        <w:rPr>
+          <w:rFonts w:ascii="Calibri" w:cs="Calibri" w:eastAsia="Calibri" w:hAnsi="Calibri"/>
+          <w:b/>
+          <w:bCs/>
+          <w:sz w:val="22"/>
+          <w:szCs w:val="22"/>
+        </w:rPr>
+        <w:t xml:space="preserve">Gewählt: Bewertungskarte ohne vorgeschaltete Frage.</w:t>
+      </w:r>
+      <w:r>
+        <w:rPr>
+          <w:rFonts w:ascii="Calibri" w:cs="Calibri" w:eastAsia="Calibri" w:hAnsi="Calibri"/>
+          <w:b w:val="false"/>
+          <w:bCs w:val="false"/>
+          <w:sz w:val="22"/>
+          <w:szCs w:val="22"/>
+        </w:rPr>
+        <w:t xml:space="preserve"> Nach einem bestandenen Abschnittstest, frühestens am dritten Lerntag und höchstens zweimal im Jahr, bietet eine Karte zwei gleichrangige Wege an, die Bewertung bei Google Play und einen Verbesserungsvorschlag. Der erste Entwurf vom 30.09.2026 sah vor, zuerst nach dem Gefallen zu fragen und nur Zufriedene zur Bewertung zu schicken. Googles Anleitung zur In-App-Bewertung untersagt jedoch jede Frage vor oder während der Bewertung, auch die, ob die App gefällt.</w:t>
+      </w:r>
+    </w:p>
+    <w:p>
+      <w:pPr>
+        <w:spacing w:after="160" w:line="276"/>
+        <w:jc w:val="both"/>
+      </w:pPr>
+      <w:r>
+        <w:rPr>
+          <w:rFonts w:ascii="Calibri" w:cs="Calibri" w:eastAsia="Calibri" w:hAnsi="Calibri"/>
+          <w:b/>
+          <w:bCs/>
+          <w:sz w:val="22"/>
+          <w:szCs w:val="22"/>
+        </w:rPr>
+        <w:t xml:space="preserve">Rückmeldungen per E-Mail.</w:t>
+      </w:r>
+      <w:r>
+        <w:rPr>
+          <w:rFonts w:ascii="Calibri" w:cs="Calibri" w:eastAsia="Calibri" w:hAnsi="Calibri"/>
+          <w:b w:val="false"/>
+          <w:bCs w:val="false"/>
+          <w:sz w:val="22"/>
+          <w:szCs w:val="22"/>
+        </w:rPr>
+        <w:t xml:space="preserve"> Seit dem 01.10.2026 beantwortet eine Vorlage Nachrichten an die Kontaktadresse sofort mit einer Eingangsbestätigung auf Deutsch und Englisch. Eine Abwesenheitsnotiz schied dafür aus, weil sie derselben Person nur alle vier Tage antwortet. Neue Nachrichten werden jeden Abend gegen 20 Uhr gesichtet.</w:t>
+      </w:r>
+    </w:p>
+    <w:p>
+      <w:pPr>
         <w:pStyle w:val="Heading2"/>
         <w:keepNext/>
         <w:spacing w:after="140" w:before="280"/>
@@ -3517,7 +3803,111 @@
           <w:sz w:val="22"/>
           <w:szCs w:val="22"/>
         </w:rPr>
-        <w:t xml:space="preserve">Eine Rückmeldung aus dem geschlossenen Test beanstandet das Erscheinungsbild als zu eintönig, sodass die Gestaltung als offener Punkt vermerkt ist.</w:t>
+        <w:t xml:space="preserve">Eine Rückmeldung aus dem geschlossenen Test beanstandete das Erscheinungsbild als zu eintönig. Eine Messung am 26.09.2026 ergab elf Farbwerte auf dem Bildschirm, nach Farbton aber nur vier. Die Sektionen benutzten dieselben Farben wie die Hauptfarbe, der Akzent und die Anzeigen für geschafft und falsch.</w:t>
+      </w:r>
+    </w:p>
+    <w:p>
+      <w:pPr>
+        <w:spacing w:after="160" w:line="276"/>
+        <w:jc w:val="both"/>
+      </w:pPr>
+      <w:r>
+        <w:rPr>
+          <w:rFonts w:ascii="Calibri" w:cs="Calibri" w:eastAsia="Calibri" w:hAnsi="Calibri"/>
+          <w:b/>
+          <w:bCs/>
+          <w:sz w:val="22"/>
+          <w:szCs w:val="22"/>
+        </w:rPr>
+        <w:t xml:space="preserve">Gewählt: eine eigene Farbe je Sektion.</w:t>
+      </w:r>
+      <w:r>
+        <w:rPr>
+          <w:rFonts w:ascii="Calibri" w:cs="Calibri" w:eastAsia="Calibri" w:hAnsi="Calibri"/>
+          <w:b w:val="false"/>
+          <w:bCs w:val="false"/>
+          <w:sz w:val="22"/>
+          <w:szCs w:val="22"/>
+        </w:rPr>
+        <w:t xml:space="preserve"> Seit dem 27.09.2026 trägt jede der neun Sektionen einen eigenen Farbton, und alle Ansichten nehmen die Farbe der aufgeklappten Sektion an. Grün, Rot und Gelb bleiben für richtig, falsch und den Akzent frei, sodass die neun Töne im Abstand von rund 20 Grad zwischen 175 und 336 Grad des Farbkreises liegen. Die helle und die dunkle Darstellung lassen sich seitdem in den Einstellungen wählen.</w:t>
+      </w:r>
+    </w:p>
+    <w:p>
+      <w:pPr>
+        <w:spacing w:after="160" w:line="276"/>
+        <w:jc w:val="both"/>
+      </w:pPr>
+      <w:r>
+        <w:rPr>
+          <w:rFonts w:ascii="Calibri" w:cs="Calibri" w:eastAsia="Calibri" w:hAnsi="Calibri"/>
+          <w:b/>
+          <w:bCs/>
+          <w:sz w:val="22"/>
+          <w:szCs w:val="22"/>
+        </w:rPr>
+        <w:t xml:space="preserve">Verworfen: ein Farbwechsel, der dem Scrollen folgt.</w:t>
+      </w:r>
+      <w:r>
+        <w:rPr>
+          <w:rFonts w:ascii="Calibri" w:cs="Calibri" w:eastAsia="Calibri" w:hAnsi="Calibri"/>
+          <w:b w:val="false"/>
+          <w:bCs w:val="false"/>
+          <w:sz w:val="22"/>
+          <w:szCs w:val="22"/>
+        </w:rPr>
+        <w:t xml:space="preserve"> Er wurde am 27.09.2026 in zwei Fassungen gebaut und noch am selben Tag wieder entfernt. Die Farbe hing beim Scrollen nach, und Ansichten außerhalb des Lernpfads trugen eine andere Farbe als der Pfad.</w:t>
+      </w:r>
+    </w:p>
+    <w:p>
+      <w:pPr>
+        <w:spacing w:after="160" w:line="276"/>
+        <w:jc w:val="both"/>
+      </w:pPr>
+      <w:r>
+        <w:rPr>
+          <w:rFonts w:ascii="Calibri" w:cs="Calibri" w:eastAsia="Calibri" w:hAnsi="Calibri"/>
+          <w:b/>
+          <w:bCs/>
+          <w:sz w:val="22"/>
+          <w:szCs w:val="22"/>
+        </w:rPr>
+        <w:t xml:space="preserve">Festtage.</w:t>
+      </w:r>
+      <w:r>
+        <w:rPr>
+          <w:rFonts w:ascii="Calibri" w:cs="Calibri" w:eastAsia="Calibri" w:hAnsi="Calibri"/>
+          <w:b w:val="false"/>
+          <w:bCs w:val="false"/>
+          <w:sz w:val="22"/>
+          <w:szCs w:val="22"/>
+        </w:rPr>
+        <w:t xml:space="preserve"> Seit dem 01.10.2026 trägt das Maskottchen zu Weihnachten, Ostern sowie Ramazanski und Kurban Bajram von selbst und kostenlos ein Festkostüm, und die Startseite zeigt einen Gruß auf Bosnisch und in der Sprache der App. Die Bajram-Feste wandern jedes Jahr um elf Tage und lassen sich nicht wie Ostern berechnen, weshalb ihre Termine bis 2036 in einer Tabelle stehen. Halloween wurde auf 2027 verschoben, da der 31.10.2026 in die erwartete Woche der Veröffentlichung fällt.</w:t>
+      </w:r>
+    </w:p>
+    <w:p>
+      <w:pPr>
+        <w:spacing w:after="160" w:line="276"/>
+        <w:jc w:val="both"/>
+      </w:pPr>
+      <w:r>
+        <w:rPr>
+          <w:rFonts w:ascii="Calibri" w:cs="Calibri" w:eastAsia="Calibri" w:hAnsi="Calibri"/>
+          <w:b/>
+          <w:bCs/>
+          <w:sz w:val="22"/>
+          <w:szCs w:val="22"/>
+        </w:rPr>
+        <w:t xml:space="preserve">Gewählt für 13 Aufnahmen: eine kroatische Stimme mit Lautschrift.</w:t>
+      </w:r>
+      <w:r>
+        <w:rPr>
+          <w:rFonts w:ascii="Calibri" w:cs="Calibri" w:eastAsia="Calibri" w:hAnsi="Calibri"/>
+          <w:b w:val="false"/>
+          <w:bCs w:val="false"/>
+          <w:sz w:val="22"/>
+          <w:szCs w:val="22"/>
+        </w:rPr>
+        <w:t xml:space="preserve"> Die bosnische Stimme der Sprachsynthese dehnte in kurzen Wörtern wie „kad“ und „od“ den Vokal, verschluckte das auslautende g und sprach „sud“ als „sub“. Lautschrift nehmen die bosnischen Stimmen laut der Stimmentabelle des Anbieters nicht an, die kroatischen dagegen schon. Nach einem Hörvergleich mehrerer Fassungen je Wort wurden am 26.09.2026 zehn Aufnahmen umgestellt und am 01.10.2026 drei weitere.</w:t>
       </w:r>
     </w:p>
     <w:p>
@@ -4562,7 +4952,7 @@
           <w:sz w:val="22"/>
           <w:szCs w:val="22"/>
         </w:rPr>
-        <w:t xml:space="preserve">Die Auswirkung A misst die Folge für das Vorhaben und nicht das Ausmaß für den einzelnen Betroffenen. Der Verlust eines einzelnen Lernstands ist für den Betroffenen endgültig, für das Vorhaben aber ein Einzelfall und daher Stufe 2. Gehen die Lernstände aller Nutzer verloren, ist es Stufe 5. Die aufgeführten Risiken stammen aus dem Projektverlauf selbst, also aus geprüften Befunden am eigenen Quelltext, aus den Regeln des Play Store und aus den Rückmeldungen des geschlossenen Tests. Zwei von ihnen sind während des Projekts eingetreten und werden in Abschnitt 4.6 beschrieben.</w:t>
+        <w:t xml:space="preserve">Die Auswirkung A misst die Folge für das Vorhaben und nicht das Ausmaß für den einzelnen Betroffenen. Der Verlust eines einzelnen Lernstands ist für den Betroffenen endgültig, für das Vorhaben aber ein Einzelfall und daher Stufe 2. Gehen die Lernstände aller Nutzer verloren, ist es Stufe 5. Die aufgeführten Risiken stammen aus dem Projektverlauf selbst, also aus geprüften Befunden am eigenen Quelltext, aus den Regeln des Play Store und aus den Rückmeldungen des geschlossenen Tests. Drei von ihnen sind während des Projekts eingetreten und werden in Abschnitt 4.6 beschrieben.</w:t>
       </w:r>
     </w:p>
     <w:p>
@@ -5458,7 +5848,7 @@
                 <w:sz w:val="18"/>
                 <w:szCs w:val="18"/>
               </w:rPr>
-              <w:t xml:space="preserve">Solange Testkennungen laufen, richtet kein Befund Schaden an. Die Behebung der Befunde erfolgt vor dem Tausch der Kennungen. Die Reihenfolge ist festgelegt, und die Korrekturen liegen als Änderungsskripte bereit. Der Wert sinkt erst nach dem Einbau und der Nachprüfung.</w:t>
+              <w:t xml:space="preserve">Solange Testkennungen laufen, richtet kein Befund Schaden an. Alle 20 Befunde wurden bis zum 30.09.2026 behoben und mit Googles Testkennungen auf zwei Geräten nachgeprüft, die drei kontogefährdenden bereits am 29.09.2026. Nicht am Gerät beobachten ließen sich zwei Teilschritte, darunter der Abbruch eines belohnten Videos vor der Belohnung, den Googles Testvideo durch eine Sperre der Zurück-Taste verhindert.</w:t>
             </w:r>
           </w:p>
         </w:tc>
@@ -5487,7 +5877,7 @@
                 <w:sz w:val="18"/>
                 <w:szCs w:val="18"/>
               </w:rPr>
-              <w:t xml:space="preserve">10</w:t>
+              <w:t xml:space="preserve">5</w:t>
             </w:r>
           </w:p>
         </w:tc>
@@ -5677,7 +6067,7 @@
                 <w:sz w:val="18"/>
                 <w:szCs w:val="18"/>
               </w:rPr>
-              <w:t xml:space="preserve">Bis zum Ende des geschlossenen Tests laufen ausschließlich Googles Testkennungen, die nicht abgerechnet werden. Der Tausch gegen die echten Kennungen erfolgt erst danach.</w:t>
+              <w:t xml:space="preserve">Bis zum Ende des geschlossenen Tests laufen ausschließlich Googles Testkennungen, die nicht abgerechnet werden. Der Tausch gegen die echten Kennungen erfolgt erst danach. Zuvor werden die eigenen Geräte als Testgeräte eingetragen, sodass sie auch nach dem Tausch nur Testanzeigen erhalten.</w:t>
             </w:r>
           </w:p>
         </w:tc>
@@ -5780,7 +6170,7 @@
                 <w:sz w:val="18"/>
                 <w:szCs w:val="18"/>
               </w:rPr>
-              <w:t xml:space="preserve"> Ohne Server liegt der Lernstand nur im Gerätespeicher. Gerätewechsel, Verlust des Geräts oder das Löschen der Anwendungsdaten beenden den Lernfortschritt.</w:t>
+              <w:t xml:space="preserve"> Ohne Server liegt der Lernstand im Gerätespeicher. Gerätewechsel, Verlust des Geräts oder das Löschen der Anwendungsdaten beenden den Lernfortschritt.</w:t>
             </w:r>
           </w:p>
         </w:tc>
@@ -5896,7 +6286,7 @@
                 <w:sz w:val="18"/>
                 <w:szCs w:val="18"/>
               </w:rPr>
-              <w:t xml:space="preserve">Die App erzeugt auf Wunsch eine Sicherungsdatei. Da sie nur dem Nutzer hilft, der sie vorher anlegt, sinkt der Wert nicht. Das Restrisiko wird als Folge der Entscheidung aus Abschnitt 3.2 in Kauf genommen.</w:t>
+              <w:t xml:space="preserve">Die App erzeugt auf Wunsch eine Sicherungsdatei, deren Übertragung auf ein zweites Gerät am 29.09.2026 über Prüfsummen nachgewiesen wurde. Zusätzlich nimmt Androids eigene Sicherung die Daten der App ins Google-Konto mit, sofern der Nutzer sie eingeschaltet hat. Da beides nur dem Nutzer hilft, der es vorher eingerichtet hat, sinkt der Wert nicht. Das Restrisiko wird als Folge der Entscheidung aus Abschnitt 3.2 in Kauf genommen.</w:t>
             </w:r>
           </w:p>
         </w:tc>
@@ -6115,7 +6505,7 @@
                 <w:sz w:val="18"/>
                 <w:szCs w:val="18"/>
               </w:rPr>
-              <w:t xml:space="preserve">Der geschlossene Test wird mit zwölf Testern auf ihren eigenen Geräten und über zwei Rückmeldewege durchgeführt, bevor die App allgemein verfügbar ist.</w:t>
+              <w:t xml:space="preserve">Der geschlossene Test wird mit zwölf Testern auf ihren eigenen Geräten und über zwei Rückmeldewege durchgeführt, bevor die App allgemein verfügbar ist. Zusätzlich wurden bis zum 29.09.2026 die 15 Prüfungen des Prüfplans aus Abschnitt 5.7 auf Geräten mit Android 10 und Android 15 abgearbeitet.</w:t>
             </w:r>
           </w:p>
         </w:tc>
@@ -6594,7 +6984,7 @@
                 <w:sz w:val="18"/>
                 <w:szCs w:val="18"/>
               </w:rPr>
-              <w:t xml:space="preserve">Dazu wird während des Tests nichts eingereicht. Sämtliche Korrekturen liegen als Änderungsskripte bereit und werden erst danach angewendet.</w:t>
+              <w:t xml:space="preserve">Dazu wird während des Tests nichts eingereicht. Die Korrekturen sind im Quelltext eingebaut, das signierte Paket in Version 88 liegt auf dem Rechner bereit, und die neuen Store-Texte und Bilder liegen als Entwurf in der Play Console. Eingereicht wird all das erst nach dem Test.</w:t>
             </w:r>
           </w:p>
         </w:tc>
@@ -7746,7 +8136,7 @@
                 <w:sz w:val="18"/>
                 <w:szCs w:val="18"/>
               </w:rPr>
-              <w:t xml:space="preserve">Projekt und Android-Hülle liegen in zwei Repositories mit entferntem Spiegel und umfassen zusammen 50 Einträge. Zugangsschlüssel und Nutzerdaten bleiben ausdrücklich außerhalb der Spiegel.</w:t>
+              <w:t xml:space="preserve">Projekt und Android-Hülle liegen in zwei Repositories mit entferntem Spiegel und umfassen zusammen 194 Einträge. Zugangsschlüssel und Nutzerdaten bleiben ausdrücklich außerhalb der Spiegel.</w:t>
             </w:r>
           </w:p>
         </w:tc>
@@ -8402,7 +8792,7 @@
                 <w:sz w:val="18"/>
                 <w:szCs w:val="18"/>
               </w:rPr>
-              <w:t xml:space="preserve">10</w:t>
+              <w:t xml:space="preserve">5</w:t>
             </w:r>
           </w:p>
         </w:tc>
@@ -10471,7 +10861,7 @@
           <w:sz w:val="22"/>
           <w:szCs w:val="22"/>
         </w:rPr>
-        <w:t xml:space="preserve"> bleibt mit 10 das größte Restrisiko, bis die Befunde eingebaut und nachgeprüft sind.</w:t>
+        <w:t xml:space="preserve"> sank am 30.09.2026 von 10 auf 5, nachdem alle 20 Befunde eingebaut und nachgeprüft waren. Das größte Restrisiko ist seitdem R5 mit 8.</w:t>
       </w:r>
     </w:p>
     <w:p>
@@ -10993,7 +11383,249 @@
                 <w:sz w:val="18"/>
                 <w:szCs w:val="18"/>
               </w:rPr>
-              <w:t xml:space="preserve">Schwerer wog der Nebenbefund, denn dieselbe Regel setzte auch den Notausstieg außer Kraft, der das Startbild wegblendet, wenn das Skript nicht anläuft. Bei abgeschalteten Animationen stand damit keine Rückversicherung zur Verfügung. Beide Korrekturen liegen als Änderungsskript bereit.</w:t>
+              <w:t xml:space="preserve">Schwerer wog der Nebenbefund, denn dieselbe Regel setzte auch den Notausstieg außer Kraft, der das Startbild wegblendet, wenn das Skript nicht anläuft. Bei abgeschalteten Animationen stand damit keine Rückversicherung zur Verfügung. Beide Korrekturen sind seit dem 26.09.2026 eingebaut und werden mit der ersten Einreichung nach dem Test ausgeliefert.</w:t>
+            </w:r>
+          </w:p>
+        </w:tc>
+      </w:tr>
+      <w:tr>
+        <w:trPr>
+          <w:cantSplit/>
+        </w:trPr>
+        <w:tc>
+          <w:tcPr>
+            <w:tcW w:type="pct" w:w="6%"/>
+            <w:tcMar>
+              <w:top w:type="dxa" w:w="60"/>
+              <w:left w:type="dxa" w:w="90"/>
+              <w:bottom w:type="dxa" w:w="60"/>
+              <w:right w:type="dxa" w:w="90"/>
+            </w:tcMar>
+            <w:vAlign w:val="center"/>
+          </w:tcPr>
+          <w:p>
+            <w:pPr>
+              <w:spacing w:after="0" w:line="240"/>
+              <w:jc w:val="center"/>
+            </w:pPr>
+            <w:r>
+              <w:rPr>
+                <w:rFonts w:ascii="Calibri" w:cs="Calibri" w:eastAsia="Calibri" w:hAnsi="Calibri"/>
+                <w:b w:val="false"/>
+                <w:bCs w:val="false"/>
+                <w:color w:val="000000"/>
+                <w:sz w:val="18"/>
+                <w:szCs w:val="18"/>
+              </w:rPr>
+              <w:t xml:space="preserve">R6</w:t>
+            </w:r>
+          </w:p>
+        </w:tc>
+        <w:tc>
+          <w:tcPr>
+            <w:tcW w:type="pct" w:w="14%"/>
+            <w:tcMar>
+              <w:top w:type="dxa" w:w="60"/>
+              <w:left w:type="dxa" w:w="90"/>
+              <w:bottom w:type="dxa" w:w="60"/>
+              <w:right w:type="dxa" w:w="90"/>
+            </w:tcMar>
+            <w:vAlign w:val="center"/>
+          </w:tcPr>
+          <w:p>
+            <w:pPr>
+              <w:spacing w:after="0" w:line="240"/>
+              <w:jc w:val="left"/>
+            </w:pPr>
+            <w:r>
+              <w:rPr>
+                <w:rFonts w:ascii="Calibri" w:cs="Calibri" w:eastAsia="Calibri" w:hAnsi="Calibri"/>
+                <w:b w:val="false"/>
+                <w:bCs w:val="false"/>
+                <w:color w:val="000000"/>
+                <w:sz w:val="18"/>
+                <w:szCs w:val="18"/>
+              </w:rPr>
+              <w:t xml:space="preserve">27./28.09.2026</w:t>
+            </w:r>
+          </w:p>
+        </w:tc>
+        <w:tc>
+          <w:tcPr>
+            <w:tcW w:type="pct" w:w="44%"/>
+            <w:tcMar>
+              <w:top w:type="dxa" w:w="60"/>
+              <w:left w:type="dxa" w:w="90"/>
+              <w:bottom w:type="dxa" w:w="60"/>
+              <w:right w:type="dxa" w:w="90"/>
+            </w:tcMar>
+            <w:vAlign w:val="center"/>
+          </w:tcPr>
+          <w:p>
+            <w:pPr>
+              <w:spacing w:after="0" w:line="240"/>
+              <w:jc w:val="left"/>
+            </w:pPr>
+            <w:r>
+              <w:rPr>
+                <w:rFonts w:ascii="Calibri" w:cs="Calibri" w:eastAsia="Calibri" w:hAnsi="Calibri"/>
+                <w:b w:val="false"/>
+                <w:bCs w:val="false"/>
+                <w:color w:val="000000"/>
+                <w:sz w:val="18"/>
+                <w:szCs w:val="18"/>
+              </w:rPr>
+              <w:t xml:space="preserve">Der Prüfplan fand am eigenen Gerät Fehler, die am Entwicklungsrechner nicht auffielen. Nach dem Sperren des Geräts verwarf die Sprechaufgabe jedes Ergebnis. Gesprochene Zahlen wurden nie erkannt, weil Androids Spracherkennung Ziffern liefert. Ohne Netz zeigte die App den für den Rechner gedachten Platzhalter als Anzeige und gab dafür ein Leben.</w:t>
+            </w:r>
+          </w:p>
+        </w:tc>
+        <w:tc>
+          <w:tcPr>
+            <w:tcW w:type="pct" w:w="36%"/>
+            <w:tcMar>
+              <w:top w:type="dxa" w:w="60"/>
+              <w:left w:type="dxa" w:w="90"/>
+              <w:bottom w:type="dxa" w:w="60"/>
+              <w:right w:type="dxa" w:w="90"/>
+            </w:tcMar>
+            <w:vAlign w:val="center"/>
+          </w:tcPr>
+          <w:p>
+            <w:pPr>
+              <w:spacing w:after="0" w:line="240"/>
+              <w:jc w:val="left"/>
+            </w:pPr>
+            <w:r>
+              <w:rPr>
+                <w:rFonts w:ascii="Calibri" w:cs="Calibri" w:eastAsia="Calibri" w:hAnsi="Calibri"/>
+                <w:b w:val="false"/>
+                <w:bCs w:val="false"/>
+                <w:color w:val="000000"/>
+                <w:sz w:val="18"/>
+                <w:szCs w:val="18"/>
+              </w:rPr>
+              <w:t xml:space="preserve">Alle drei wurden am Tag ihres Fundes behoben. Der dritte stand bereits seit dem 20.09.2026 als Befund in der Prüfung der Werbeeinbindung.</w:t>
+            </w:r>
+          </w:p>
+        </w:tc>
+      </w:tr>
+      <w:tr>
+        <w:trPr>
+          <w:cantSplit/>
+        </w:trPr>
+        <w:tc>
+          <w:tcPr>
+            <w:tcW w:type="pct" w:w="6%"/>
+            <w:tcMar>
+              <w:top w:type="dxa" w:w="60"/>
+              <w:left w:type="dxa" w:w="90"/>
+              <w:bottom w:type="dxa" w:w="60"/>
+              <w:right w:type="dxa" w:w="90"/>
+            </w:tcMar>
+            <w:vAlign w:val="center"/>
+          </w:tcPr>
+          <w:p>
+            <w:pPr>
+              <w:spacing w:after="0" w:line="240"/>
+              <w:jc w:val="center"/>
+            </w:pPr>
+            <w:r>
+              <w:rPr>
+                <w:rFonts w:ascii="Calibri" w:cs="Calibri" w:eastAsia="Calibri" w:hAnsi="Calibri"/>
+                <w:b w:val="false"/>
+                <w:bCs w:val="false"/>
+                <w:color w:val="000000"/>
+                <w:sz w:val="18"/>
+                <w:szCs w:val="18"/>
+              </w:rPr>
+              <w:t xml:space="preserve">R11</w:t>
+            </w:r>
+          </w:p>
+        </w:tc>
+        <w:tc>
+          <w:tcPr>
+            <w:tcW w:type="pct" w:w="14%"/>
+            <w:tcMar>
+              <w:top w:type="dxa" w:w="60"/>
+              <w:left w:type="dxa" w:w="90"/>
+              <w:bottom w:type="dxa" w:w="60"/>
+              <w:right w:type="dxa" w:w="90"/>
+            </w:tcMar>
+            <w:vAlign w:val="center"/>
+          </w:tcPr>
+          <w:p>
+            <w:pPr>
+              <w:spacing w:after="0" w:line="240"/>
+              <w:jc w:val="left"/>
+            </w:pPr>
+            <w:r>
+              <w:rPr>
+                <w:rFonts w:ascii="Calibri" w:cs="Calibri" w:eastAsia="Calibri" w:hAnsi="Calibri"/>
+                <w:b w:val="false"/>
+                <w:bCs w:val="false"/>
+                <w:color w:val="000000"/>
+                <w:sz w:val="18"/>
+                <w:szCs w:val="18"/>
+              </w:rPr>
+              <w:t xml:space="preserve">30.09.2026</w:t>
+            </w:r>
+          </w:p>
+        </w:tc>
+        <w:tc>
+          <w:tcPr>
+            <w:tcW w:type="pct" w:w="44%"/>
+            <w:tcMar>
+              <w:top w:type="dxa" w:w="60"/>
+              <w:left w:type="dxa" w:w="90"/>
+              <w:bottom w:type="dxa" w:w="60"/>
+              <w:right w:type="dxa" w:w="90"/>
+            </w:tcMar>
+            <w:vAlign w:val="center"/>
+          </w:tcPr>
+          <w:p>
+            <w:pPr>
+              <w:spacing w:after="0" w:line="240"/>
+              <w:jc w:val="left"/>
+            </w:pPr>
+            <w:r>
+              <w:rPr>
+                <w:rFonts w:ascii="Calibri" w:cs="Calibri" w:eastAsia="Calibri" w:hAnsi="Calibri"/>
+                <w:b w:val="false"/>
+                <w:bCs w:val="false"/>
+                <w:color w:val="000000"/>
+                <w:sz w:val="18"/>
+                <w:szCs w:val="18"/>
+              </w:rPr>
+              <w:t xml:space="preserve">Drei geänderte Dateien der Android-Hülle lagen seit der ersten Sicherung am 20.09.2026 nur auf dem Arbeitsrechner. Aufgefallen ist dies bei der Suche nach offenen Aufgaben.</w:t>
+            </w:r>
+          </w:p>
+        </w:tc>
+        <w:tc>
+          <w:tcPr>
+            <w:tcW w:type="pct" w:w="36%"/>
+            <w:tcMar>
+              <w:top w:type="dxa" w:w="60"/>
+              <w:left w:type="dxa" w:w="90"/>
+              <w:bottom w:type="dxa" w:w="60"/>
+              <w:right w:type="dxa" w:w="90"/>
+            </w:tcMar>
+            <w:vAlign w:val="center"/>
+          </w:tcPr>
+          <w:p>
+            <w:pPr>
+              <w:spacing w:after="0" w:line="240"/>
+              <w:jc w:val="left"/>
+            </w:pPr>
+            <w:r>
+              <w:rPr>
+                <w:rFonts w:ascii="Calibri" w:cs="Calibri" w:eastAsia="Calibri" w:hAnsi="Calibri"/>
+                <w:b w:val="false"/>
+                <w:bCs w:val="false"/>
+                <w:color w:val="000000"/>
+                <w:sz w:val="18"/>
+                <w:szCs w:val="18"/>
+              </w:rPr>
+              <w:t xml:space="preserve">Ein Defekt des Rechners hätte diese Änderungen gekostet, darunter eine Korrektur, ohne die die App eine Änderung am Abonnement beim Kaltstart verpasste. Die Dateien wurden noch am selben Tag eingetragen und in den Spiegel übertragen.</w:t>
             </w:r>
           </w:p>
         </w:tc>
@@ -11017,7 +11649,7 @@
           <w:sz w:val="22"/>
           <w:szCs w:val="22"/>
         </w:rPr>
-        <w:t xml:space="preserve">Beide Fälle zu R6 bestätigen die Einstufung, da sie erst auf den Geräten sichtbar wurden und nicht am Entwicklungsrechner. Damit hat der geschlossene Test seinen Zweck erfüllt, bevor die App allgemein verfügbar ist.</w:t>
+        <w:t xml:space="preserve">Alle drei Fälle zu R6 bestätigen die Einstufung, da sie erst auf den Geräten sichtbar wurden und nicht am Entwicklungsrechner. Damit haben der geschlossene Test und der Prüfplan ihren Zweck erfüllt, bevor die App allgemein verfügbar ist.</w:t>
       </w:r>
     </w:p>
     <w:p>
@@ -11074,7 +11706,7 @@
           <w:sz w:val="22"/>
           <w:szCs w:val="22"/>
         </w:rPr>
-        <w:t xml:space="preserve">Gearbeitet wurde mit Thonny für die Python-Dateien, mit Android Studio für die Android-Hülle und mit dem KI-Assistenten Claude Code, dessen Sitzungsprotokolle die Grundlage der Zeiterfassung in Abschnitt 5.6 bilden. Die vollständige Aufstellung steht in der Eigenständigkeitserklärung. Inhalt und Programm sind voneinander getrennt. Der Lernstoff steht in Python-Dateien: vokabeln.py mit 1.639 Zeilen, sprachen.py mit 3.476, grammatik.py mit 377 und geschichten.py mit 300. Daraus erzeugt ein Skript je Oberflächensprache eine Datei im JSON-Format, ein zweites bringt diese in die Android-Hülle und baut das Paket. Dabei werden Browser und Gerät von demselben Skript beliefert, sodass die beiden Fassungen inhaltlich nicht voneinander abweichen können.</w:t>
+        <w:t xml:space="preserve">Gearbeitet wurde mit Thonny für die Python-Dateien, mit Android Studio für die Android-Hülle und mit dem KI-Assistenten Claude Code, dessen Sitzungsprotokolle die Grundlage der Zeiterfassung in Abschnitt 5.6 bilden. Für die Prüfungen auf dem Gerät kam am 27.09.2026 eine Fernwartung über die Android Debug Bridge hinzu, mit der Lektionen durch echte Klicks auf die Bedienelemente gespielt und Werte aus dem laufenden Programm ausgelesen werden. Die vollständige Aufstellung steht in der Eigenständigkeitserklärung. Inhalt und Programm sind voneinander getrennt. Der Lernstoff steht in Python-Dateien: vokabeln.py mit 2.535 Zeilen, sprachen.py mit 4.211, grammatik.py mit 377 und geschichten.py mit 300. Daraus erzeugt ein Skript je Oberflächensprache eine Datei im JSON-Format, ein zweites bringt diese in die Android-Hülle und baut das Paket. Dabei werden Browser und Gerät aus derselben Ladefunktion beliefert. Damit die beiden Fassungen inhaltlich nicht voneinander abweichen, bricht das zweite Skript seit dem 26.09.2026 ab, wenn die erzeugten Dateien älter sind als ihre Quellen.</w:t>
       </w:r>
     </w:p>
     <w:p>
@@ -11100,7 +11732,7 @@
           <w:sz w:val="22"/>
           <w:szCs w:val="22"/>
         </w:rPr>
-        <w:t xml:space="preserve"> Mit der Entscheidung gegen einen eigenen Server (Abschnitt 3.2) wurden Anmeldung, Kontoverwaltung und Sitzungsverwaltung aus der ausgelieferten App entfernt. Am 23.09.2026 wurden weitere 151 Zeilen entfernt, die seit dem Umbau nicht mehr erreichbar waren. Ein Rest des alten Servers blieb erhalten, dient aber nur noch als Werkzeug am Rechner, denn das Skript für die Inhalte ruft dessen Ladefunktion auf.</w:t>
+        <w:t xml:space="preserve"> Mit der Entscheidung gegen einen eigenen Server (Abschnitt 3.2) wurden Anmeldung, Kontoverwaltung und Sitzungsverwaltung in der ausgelieferten App stillgelegt. Am 23.09.2026 wurden 151 Zeilen entfernt, die seit dem Umbau nicht mehr erreichbar waren. Seit dem 26.09.2026 ist die Anmeldung über einen Schalter auch am Rechner abgeschaltet, sodass sich die App dort wie auf dem Gerät verhält. Ihr Code steht weiterhin im Programm. Ein Rest des alten Servers blieb erhalten, dient aber nur noch als Werkzeug am Rechner, denn das Skript für die Inhalte ruft dessen Ladefunktion auf.</w:t>
       </w:r>
     </w:p>
     <w:p>
@@ -11126,7 +11758,7 @@
           <w:sz w:val="22"/>
           <w:szCs w:val="22"/>
         </w:rPr>
-        <w:t xml:space="preserve"> Jedes Skript ersetzt genau bezeichnete Textabschnitte, zählt die Treffer und bricht ab, wenn ein gesuchter Abschnitt nicht genau einmal vorkommt. Ohne den Schalter für das Schreiben erfolgt nur ein Probelauf, sodass ein halb geändertes Programm nicht entstehen kann. Acht solcher Skripte liegen für den ersten Bau nach dem Test bereit.</w:t>
+        <w:t xml:space="preserve"> Jedes Skript ersetzt genau bezeichnete Textabschnitte, zählt die Treffer und bricht ab, wenn ein gesuchter Abschnitt nicht genau einmal vorkommt. Ohne den Schalter für das Schreiben erfolgt nur ein Probelauf, sodass ein halb geändertes Programm nicht entstehen kann. Am 26.09.2026 wurden sechs solcher Skripte angewandt. Für mehrere voneinander unabhängige Änderungen kam am selben Tag ein Werkzeug hinzu, das jeden Entwurf einzeln prüft und einen fehlerhaften überspringt, ohne die übrigen aufzuhalten. Auf diesem Weg wurden 20 Änderungen übernommen, die zuvor einen zweiten Prüfdurchgang bestanden hatten. Ausgeliefert werden alle diese Änderungen erst nach dem Ende des geschlossenen Tests.</w:t>
       </w:r>
     </w:p>
     <w:p>
@@ -11317,7 +11949,7 @@
                 <w:sz w:val="18"/>
                 <w:szCs w:val="18"/>
               </w:rPr>
-              <w:t xml:space="preserve">5.062 Zeilen, 279 kB</w:t>
+              <w:t xml:space="preserve">8.528 Zeilen, 479 kB</w:t>
             </w:r>
           </w:p>
         </w:tc>
@@ -11409,7 +12041,7 @@
                 <w:sz w:val="18"/>
                 <w:szCs w:val="18"/>
               </w:rPr>
-              <w:t xml:space="preserve">8 Dateien, 1,5 MB</w:t>
+              <w:t xml:space="preserve">8 Dateien, 2,0 MB</w:t>
             </w:r>
           </w:p>
         </w:tc>
@@ -11501,7 +12133,7 @@
                 <w:sz w:val="18"/>
                 <w:szCs w:val="18"/>
               </w:rPr>
-              <w:t xml:space="preserve">1.562 Dateien</w:t>
+              <w:t xml:space="preserve">2.332 Aufnahmen, 30,3 MB</w:t>
             </w:r>
           </w:p>
         </w:tc>
@@ -11593,7 +12225,7 @@
                 <w:sz w:val="18"/>
                 <w:szCs w:val="18"/>
               </w:rPr>
-              <w:t xml:space="preserve">27</w:t>
+              <w:t xml:space="preserve">48</w:t>
             </w:r>
           </w:p>
         </w:tc>
@@ -11622,7 +12254,7 @@
                 <w:sz w:val="18"/>
                 <w:szCs w:val="18"/>
               </w:rPr>
-              <w:t xml:space="preserve">Lernstoff, Erzeuger, Änderungsskripte</w:t>
+              <w:t xml:space="preserve">Lernstoff, Erzeuger, Änderungs- und Prüfskripte</w:t>
             </w:r>
           </w:p>
         </w:tc>
@@ -11777,7 +12409,7 @@
                 <w:sz w:val="18"/>
                 <w:szCs w:val="18"/>
               </w:rPr>
-              <w:t xml:space="preserve">104 Zeilen</w:t>
+              <w:t xml:space="preserve">228 Zeilen</w:t>
             </w:r>
           </w:p>
         </w:tc>
@@ -11806,7 +12438,7 @@
                 <w:sz w:val="18"/>
                 <w:szCs w:val="18"/>
               </w:rPr>
-              <w:t xml:space="preserve">Einwilligung nach europäischem Datenschutzrecht</w:t>
+              <w:t xml:space="preserve">Einwilligung nach europäischem Datenschutzrecht, Kennung und Prüfwerkzeug für Testgeräte</w:t>
             </w:r>
           </w:p>
         </w:tc>
@@ -11840,7 +12472,7 @@
                 <w:sz w:val="18"/>
                 <w:szCs w:val="18"/>
               </w:rPr>
-              <w:t xml:space="preserve">MainActivity.java</w:t>
+              <w:t xml:space="preserve">ZmajBewertung.java</w:t>
             </w:r>
           </w:p>
         </w:tc>
@@ -11869,7 +12501,7 @@
                 <w:sz w:val="18"/>
                 <w:szCs w:val="18"/>
               </w:rPr>
-              <w:t xml:space="preserve">20 Zeilen</w:t>
+              <w:t xml:space="preserve">101 Zeilen</w:t>
             </w:r>
           </w:p>
         </w:tc>
@@ -11898,7 +12530,7 @@
                 <w:sz w:val="18"/>
                 <w:szCs w:val="18"/>
               </w:rPr>
-              <w:t xml:space="preserve">Einstiegspunkt der Hülle</w:t>
+              <w:t xml:space="preserve">Bewertung bei Google Play</w:t>
             </w:r>
           </w:p>
         </w:tc>
@@ -11932,6 +12564,98 @@
                 <w:sz w:val="18"/>
                 <w:szCs w:val="18"/>
               </w:rPr>
+              <w:t xml:space="preserve">MainActivity.java</w:t>
+            </w:r>
+          </w:p>
+        </w:tc>
+        <w:tc>
+          <w:tcPr>
+            <w:tcW w:type="pct" w:w="26%"/>
+            <w:tcMar>
+              <w:top w:type="dxa" w:w="60"/>
+              <w:left w:type="dxa" w:w="90"/>
+              <w:bottom w:type="dxa" w:w="60"/>
+              <w:right w:type="dxa" w:w="90"/>
+            </w:tcMar>
+            <w:vAlign w:val="center"/>
+          </w:tcPr>
+          <w:p>
+            <w:pPr>
+              <w:spacing w:after="0" w:line="240"/>
+              <w:jc w:val="left"/>
+            </w:pPr>
+            <w:r>
+              <w:rPr>
+                <w:rFonts w:ascii="Calibri" w:cs="Calibri" w:eastAsia="Calibri" w:hAnsi="Calibri"/>
+                <w:b w:val="false"/>
+                <w:bCs w:val="false"/>
+                <w:color w:val="000000"/>
+                <w:sz w:val="18"/>
+                <w:szCs w:val="18"/>
+              </w:rPr>
+              <w:t xml:space="preserve">22 Zeilen</w:t>
+            </w:r>
+          </w:p>
+        </w:tc>
+        <w:tc>
+          <w:tcPr>
+            <w:tcW w:type="pct" w:w="40%"/>
+            <w:tcMar>
+              <w:top w:type="dxa" w:w="60"/>
+              <w:left w:type="dxa" w:w="90"/>
+              <w:bottom w:type="dxa" w:w="60"/>
+              <w:right w:type="dxa" w:w="90"/>
+            </w:tcMar>
+            <w:vAlign w:val="center"/>
+          </w:tcPr>
+          <w:p>
+            <w:pPr>
+              <w:spacing w:after="0" w:line="240"/>
+              <w:jc w:val="left"/>
+            </w:pPr>
+            <w:r>
+              <w:rPr>
+                <w:rFonts w:ascii="Calibri" w:cs="Calibri" w:eastAsia="Calibri" w:hAnsi="Calibri"/>
+                <w:b w:val="false"/>
+                <w:bCs w:val="false"/>
+                <w:color w:val="000000"/>
+                <w:sz w:val="18"/>
+                <w:szCs w:val="18"/>
+              </w:rPr>
+              <w:t xml:space="preserve">Einstiegspunkt der Hülle</w:t>
+            </w:r>
+          </w:p>
+        </w:tc>
+      </w:tr>
+      <w:tr>
+        <w:trPr>
+          <w:cantSplit/>
+        </w:trPr>
+        <w:tc>
+          <w:tcPr>
+            <w:tcW w:type="pct" w:w="34%"/>
+            <w:tcMar>
+              <w:top w:type="dxa" w:w="60"/>
+              <w:left w:type="dxa" w:w="90"/>
+              <w:bottom w:type="dxa" w:w="60"/>
+              <w:right w:type="dxa" w:w="90"/>
+            </w:tcMar>
+            <w:vAlign w:val="center"/>
+          </w:tcPr>
+          <w:p>
+            <w:pPr>
+              <w:spacing w:after="0" w:line="240"/>
+              <w:jc w:val="left"/>
+            </w:pPr>
+            <w:r>
+              <w:rPr>
+                <w:rFonts w:ascii="Calibri" w:cs="Calibri" w:eastAsia="Calibri" w:hAnsi="Calibri"/>
+                <w:b w:val="false"/>
+                <w:bCs w:val="false"/>
+                <w:color w:val="000000"/>
+                <w:sz w:val="18"/>
+                <w:szCs w:val="18"/>
+              </w:rPr>
               <w:t xml:space="preserve">app-release.aab</w:t>
             </w:r>
           </w:p>
@@ -11961,7 +12685,7 @@
                 <w:sz w:val="18"/>
                 <w:szCs w:val="18"/>
               </w:rPr>
-              <w:t xml:space="preserve">25,2 MB</w:t>
+              <w:t xml:space="preserve">34,4 MB</w:t>
             </w:r>
           </w:p>
         </w:tc>
@@ -12014,7 +12738,7 @@
           <w:sz w:val="22"/>
           <w:szCs w:val="22"/>
         </w:rPr>
-        <w:t xml:space="preserve">Das Programm liegt in einer einzigen Datei, ohne Bauwerkzeug und ohne Übersetzungsschritt. Zur Gliederung dienen 59 Kommentarbänder, die die 5.062 Zeilen in benannte Abschnitte unterteilen.</w:t>
+        <w:t xml:space="preserve">Das Programm liegt in einer einzigen Datei, ohne Bauwerkzeug und ohne Übersetzungsschritt. Zur Gliederung dienen 77 Kommentarbänder, die die 8.528 Zeilen in benannte Abschnitte unterteilen.</w:t>
       </w:r>
     </w:p>
     <w:p>
@@ -12074,7 +12798,7 @@
           <w:sz w:val="22"/>
           <w:szCs w:val="22"/>
         </w:rPr>
-        <w:t xml:space="preserve"> Der Lernstand liegt unter einem einzigen Schlüssel im Speicher des Geräts, daneben bestehen vierzehn weitere Schlüssel für Einstellungen, Sprache und Einwilligung. Der Lernstand selbst ist ein Objekt mit fünfzehn Feldern: die sicher beherrschten Wörter, die bestandenen Abschnitte, die gelesenen Geschichten, die Lerntage, zurückgestellte Lücken, gekaufte Gegenstände, Leben, Serienschutz, Tagesaufgabe, zwei Münzstände, das getragene Aussehen, gefeierte Wegmarken, der Rekord und der Zeitpunkt.</w:t>
+        <w:t xml:space="preserve"> Der Lernstand liegt unter einem einzigen Schlüssel im Speicher des Geräts, daneben bestehen zwanzig weitere Schlüssel, unter anderem für Einstellungen, Sprache, Einwilligung, Vollversion und Erinnerungen. Der Lernstand selbst ist ein Objekt mit neunzehn Feldern: die sicher beherrschten Wörter, die bestandenen Abschnitte, die gelesenen Geschichten, die Lerntage, die vom Serienschutz überbrückten Tage, gekaufte Gegenstände, Leben, Serienschutz, Tagesaufgabe, zwei Münzstände, das getragene Aussehen, gefeierte Wegmarken, der Rekord, der Zeitpunkt, das Jahr der zuletzt gewährten Geschenktage, die Einstufung, die Sammlung falsch beantworteter Aufgaben und der Stand der Bewertungsabfrage.</w:t>
       </w:r>
     </w:p>
     <w:p>
@@ -12321,7 +13045,7 @@
                 <w:sz w:val="18"/>
                 <w:szCs w:val="18"/>
               </w:rPr>
-              <w:t xml:space="preserve">Acht von zehn richtigen Antworten setzen den Abschnitt auf bestanden und den folgenden auf offen.</w:t>
+              <w:t xml:space="preserve">Acht von zehn richtigen Antworten setzen den Abschnitt auf bestanden und den folgenden auf offen. Die Einstufung beim ersten Start kann mehrere Abschnitte auf einmal öffnen, ohne sie auf bestanden zu setzen.</w:t>
             </w:r>
           </w:p>
         </w:tc>
@@ -12384,7 +13108,7 @@
                 <w:sz w:val="18"/>
                 <w:szCs w:val="18"/>
               </w:rPr>
-              <w:t xml:space="preserve">Fünf Fehlversuche sperren den Zugang. Die Sperre bleibt auch nach dem Beenden der App bestehen.</w:t>
+              <w:t xml:space="preserve">Fünf Fehlversuche sperren den Zugang. Die Sperre bleibt auch nach dem Beenden der App bestehen. Der Abschlusstest eines Abschnitts bleibt gesperrt, bis jedes seiner Wörter einmal richtig beantwortet ist.</w:t>
             </w:r>
           </w:p>
         </w:tc>
@@ -12447,7 +13171,7 @@
                 <w:sz w:val="18"/>
                 <w:szCs w:val="18"/>
               </w:rPr>
-              <w:t xml:space="preserve">Ein Zeitglied gibt nach 120 Minuten je ein Leben frei. Ein Tageszähler begrenzt die Werbung auf sechs Einblendungen und wird um Mitternacht zurückgesetzt.</w:t>
+              <w:t xml:space="preserve">Ein Zeitglied gibt nach 120 Minuten je ein Leben frei. Ein Tageszähler begrenzt die freiwilligen Videos für ein Leben auf sechs am Tag. Die Anzeige nach Lektion und Test ist seit dem 27.09.2026 nicht mehr begrenzt.</w:t>
             </w:r>
           </w:p>
         </w:tc>
@@ -12560,7 +13284,7 @@
           <w:sz w:val="22"/>
           <w:szCs w:val="22"/>
         </w:rPr>
-        <w:t xml:space="preserve">Serienschutz.</w:t>
+        <w:t xml:space="preserve">Wiederholen.</w:t>
       </w:r>
       <w:r>
         <w:rPr>
@@ -12570,7 +13294,33 @@
           <w:sz w:val="22"/>
           <w:szCs w:val="22"/>
         </w:rPr>
-        <w:t xml:space="preserve"> Nach zehn zusammenhängenden Lerntagen entsteht ein Schutz, der einen versäumten Tag auffängt. Höchstens zwei solcher Schutztage lassen sich gleichzeitig halten. Der Schutz ist die einzige Stelle, an der eine Zeitmessung über den laufenden Tag hinausreicht.</w:t>
+        <w:t xml:space="preserve"> Seit dem 30.09.2026 sammelt ein eigener Reiter falsch beantwortete Aufgaben aus Lektionen und Abschlusstests. Eine Runde umfasst zehn dieser Aufgaben und zählt wie eine Lektion. Eine Aufgabe scheidet aus, sobald sie zweimal hintereinander richtig beantwortet wurde. Die richtige Antwort direkt nach dem Fehler in derselben Lektion zählt dabei nicht mit, da die Lösung kurz zuvor noch auf dem Bildschirm stand.</w:t>
+      </w:r>
+    </w:p>
+    <w:p>
+      <w:pPr>
+        <w:spacing w:after="160" w:line="276"/>
+        <w:jc w:val="both"/>
+      </w:pPr>
+      <w:r>
+        <w:rPr>
+          <w:rFonts w:ascii="Calibri" w:cs="Calibri" w:eastAsia="Calibri" w:hAnsi="Calibri"/>
+          <w:b/>
+          <w:bCs/>
+          <w:sz w:val="22"/>
+          <w:szCs w:val="22"/>
+        </w:rPr>
+        <w:t xml:space="preserve">Serienschutz.</w:t>
+      </w:r>
+      <w:r>
+        <w:rPr>
+          <w:rFonts w:ascii="Calibri" w:cs="Calibri" w:eastAsia="Calibri" w:hAnsi="Calibri"/>
+          <w:b w:val="false"/>
+          <w:bCs w:val="false"/>
+          <w:sz w:val="22"/>
+          <w:szCs w:val="22"/>
+        </w:rPr>
+        <w:t xml:space="preserve"> Ein Schutz fängt einen versäumten Tag auf, sodass die Lernserie bestehen bleibt. Zu Beginn liegt einer bereit, danach wächst alle zehn Tage ein weiterer nach, und höchstens zwei lassen sich gleichzeitig halten. Über den laufenden Tag hinaus reichen daneben drei weitere Zeitmessungen. Zu jedem Jahrestag der ersten Nutzung schaltet die App fünf Tage Vollversion frei, zwischen zwei Bitten um eine Bewertung liegen mindestens 90 Tage, und die Erinnerungen am Abend werden bis zu sechs Tage im Voraus geplant.</w:t>
       </w:r>
     </w:p>
     <w:p>
@@ -13205,6 +13955,69 @@
                 <w:sz w:val="18"/>
                 <w:szCs w:val="18"/>
               </w:rPr>
+              <w:t xml:space="preserve">Store-Eintrag mit neuen Bildern und signiertes Paket für die Produktion</w:t>
+            </w:r>
+          </w:p>
+        </w:tc>
+        <w:tc>
+          <w:tcPr>
+            <w:tcW w:type="pct" w:w="38%"/>
+            <w:tcMar>
+              <w:top w:type="dxa" w:w="60"/>
+              <w:left w:type="dxa" w:w="90"/>
+              <w:bottom w:type="dxa" w:w="60"/>
+              <w:right w:type="dxa" w:w="90"/>
+            </w:tcMar>
+            <w:vAlign w:val="center"/>
+          </w:tcPr>
+          <w:p>
+            <w:pPr>
+              <w:spacing w:after="0" w:line="240"/>
+              <w:jc w:val="left"/>
+            </w:pPr>
+            <w:r>
+              <w:rPr>
+                <w:rFonts w:ascii="Calibri" w:cs="Calibri" w:eastAsia="Calibri" w:hAnsi="Calibri"/>
+                <w:b w:val="false"/>
+                <w:bCs w:val="false"/>
+                <w:color w:val="000000"/>
+                <w:sz w:val="18"/>
+                <w:szCs w:val="18"/>
+              </w:rPr>
+              <w:t xml:space="preserve">vorbereitet, 01.10.2026</w:t>
+            </w:r>
+          </w:p>
+        </w:tc>
+      </w:tr>
+      <w:tr>
+        <w:trPr>
+          <w:cantSplit/>
+        </w:trPr>
+        <w:tc>
+          <w:tcPr>
+            <w:tcW w:type="pct" w:w="62%"/>
+            <w:tcMar>
+              <w:top w:type="dxa" w:w="60"/>
+              <w:left w:type="dxa" w:w="90"/>
+              <w:bottom w:type="dxa" w:w="60"/>
+              <w:right w:type="dxa" w:w="90"/>
+            </w:tcMar>
+            <w:vAlign w:val="center"/>
+          </w:tcPr>
+          <w:p>
+            <w:pPr>
+              <w:spacing w:after="0" w:line="240"/>
+              <w:jc w:val="left"/>
+            </w:pPr>
+            <w:r>
+              <w:rPr>
+                <w:rFonts w:ascii="Calibri" w:cs="Calibri" w:eastAsia="Calibri" w:hAnsi="Calibri"/>
+                <w:b w:val="false"/>
+                <w:bCs w:val="false"/>
+                <w:color w:val="000000"/>
+                <w:sz w:val="18"/>
+                <w:szCs w:val="18"/>
+              </w:rPr>
               <w:t xml:space="preserve">Antrag auf Produktionszugriff</w:t>
             </w:r>
           </w:p>
@@ -13516,12 +14329,90 @@
       <w:r>
         <w:rPr>
           <w:rFonts w:ascii="Calibri" w:cs="Calibri" w:eastAsia="Calibri" w:hAnsi="Calibri"/>
+          <w:b/>
+          <w:bCs/>
+          <w:sz w:val="22"/>
+          <w:szCs w:val="22"/>
+        </w:rPr>
+        <w:t xml:space="preserve">Neue Texte fehlten in der Fassung für das Gerät.</w:t>
+      </w:r>
+      <w:r>
+        <w:rPr>
+          <w:rFonts w:ascii="Calibri" w:cs="Calibri" w:eastAsia="Calibri" w:hAnsi="Calibri"/>
           <w:b w:val="false"/>
           <w:bCs w:val="false"/>
           <w:sz w:val="22"/>
           <w:szCs w:val="22"/>
         </w:rPr>
-        <w:t xml:space="preserve">Vier dieser fünf Probleme wären erst beim Nutzer aufgefallen und nicht bereits beim Entwickeln am Rechner. Drei davon hätten die App in einem Teilbereich unbrauchbar gemacht, ohne dass eine Fehlermeldung erzeugt worden wäre.</w:t>
+        <w:t xml:space="preserve"> Nach dem Anwenden der Änderungsskripte am 26.09.2026 stand in den Einstellungen der Textschlüssel „set.sicherung_suchen“ anstelle des Satzes. Das Skript hatte den Text in sprachen.py eingetragen, die App auf dem Gerät liest ihre Texte aber ausschließlich aus den erzeugten JSON-Dateien. Das Skript, das diese Dateien erzeugt, war danach nicht gelaufen, und das Bauskript ruft es nicht selbst auf. Mit dem Server am Rechner bleibt ein solcher Fehler unsichtbar, weil dieser die Python-Dateien bei jedem Aufruf frisch einliest. Seither bricht das Bauskript ab, wenn die JSON-Dateien älter sind als ihre Quellen, und ein Prüfskript meldet Textschlüssel, die nicht in allen Sprachen vorliegen.</w:t>
+      </w:r>
+    </w:p>
+    <w:p>
+      <w:pPr>
+        <w:spacing w:after="160" w:line="276"/>
+        <w:jc w:val="both"/>
+      </w:pPr>
+      <w:r>
+        <w:rPr>
+          <w:rFonts w:ascii="Calibri" w:cs="Calibri" w:eastAsia="Calibri" w:hAnsi="Calibri"/>
+          <w:b/>
+          <w:bCs/>
+          <w:sz w:val="22"/>
+          <w:szCs w:val="22"/>
+        </w:rPr>
+        <w:t xml:space="preserve">Die Anzeige nach der Lektion wurde nicht gezählt.</w:t>
+      </w:r>
+      <w:r>
+        <w:rPr>
+          <w:rFonts w:ascii="Calibri" w:cs="Calibri" w:eastAsia="Calibri" w:hAnsi="Calibri"/>
+          <w:b w:val="false"/>
+          <w:bCs w:val="false"/>
+          <w:sz w:val="22"/>
+          <w:szCs w:val="22"/>
+        </w:rPr>
+        <w:t xml:space="preserve"> Am 27.09.2026 wies der Tageszähler am Gerät null Anzeigen nach der Lektion aus, aber vier freiwillige Videos. Ursache war, dass die Anmeldung der Ereignishorcher für das Erscheinen und Schließen einer Anzeige asynchron läuft und nicht abgewartet wurde. Die Anzeige erschien, ihre Ereignisse kamen aber nicht an, sodass die App zwei Minuten bis zum Ablauf einer Frist wartete und die Anzeige als nicht gelaufen wertete. Die freiwilligen Videos werten statt der Horcher einen Rückgabewert aus und waren deshalb nicht betroffen. Seither wird jede Anmeldung abgewartet, und gezählt wird, sobald eine Anzeige zu sehen war.</w:t>
+      </w:r>
+    </w:p>
+    <w:p>
+      <w:pPr>
+        <w:spacing w:after="160" w:line="276"/>
+        <w:jc w:val="both"/>
+      </w:pPr>
+      <w:r>
+        <w:rPr>
+          <w:rFonts w:ascii="Calibri" w:cs="Calibri" w:eastAsia="Calibri" w:hAnsi="Calibri"/>
+          <w:b/>
+          <w:bCs/>
+          <w:sz w:val="22"/>
+          <w:szCs w:val="22"/>
+        </w:rPr>
+        <w:t xml:space="preserve">Ein Testgerät hat zwei Kennungen.</w:t>
+      </w:r>
+      <w:r>
+        <w:rPr>
+          <w:rFonts w:ascii="Calibri" w:cs="Calibri" w:eastAsia="Calibri" w:hAnsi="Calibri"/>
+          <w:b w:val="false"/>
+          <w:bCs w:val="false"/>
+          <w:sz w:val="22"/>
+          <w:szCs w:val="22"/>
+        </w:rPr>
+        <w:t xml:space="preserve"> Die eigenen Geräte werden bei AdMob als Testgeräte eingetragen, damit sie nach dem Tausch der Werbekennungen keine echten Anzeigen erhalten. Die dafür verlangte Kennung erwies sich am 30.09.2026 bei einer Messung am Gerät als MD5-Wert der Android-ID und nicht der Werbe-ID, wobei sich die Quellen im Netz an dieser Stelle widersprechen. Seit Android 8 hängt die Android-ID vom Signierschlüssel der App ab. Debug- und Play-Fassung liefern auf demselben Gerät deshalb zwei verschiedene Kennungen, und der Wert aus der Debug-Fassung hätte die veröffentlichte App nicht geschützt. Die App zeigt seither ihre Kennung und die Werbe-ID des Geräts selbst an. Für die Geräte ist der Eintrag über die Werbe-ID in der AdMob-Konsole vorgesehen, da er für beide Fassungen gilt.</w:t>
+      </w:r>
+    </w:p>
+    <w:p>
+      <w:pPr>
+        <w:spacing w:after="160" w:line="276"/>
+        <w:jc w:val="both"/>
+      </w:pPr>
+      <w:r>
+        <w:rPr>
+          <w:rFonts w:ascii="Calibri" w:cs="Calibri" w:eastAsia="Calibri" w:hAnsi="Calibri"/>
+          <w:b w:val="false"/>
+          <w:bCs w:val="false"/>
+          <w:sz w:val="22"/>
+          <w:szCs w:val="22"/>
+        </w:rPr>
+        <w:t xml:space="preserve">Sieben dieser acht Probleme wären erst auf dem Gerät oder beim Nutzer aufgefallen und nicht bereits beim Entwickeln am Rechner. Drei davon hätten die App in einem Teilbereich unbrauchbar gemacht, ohne dass eine Fehlermeldung erzeugt worden wäre.</w:t>
       </w:r>
     </w:p>
     <w:p>
@@ -13555,7 +14446,7 @@
           <w:sz w:val="22"/>
           <w:szCs w:val="22"/>
         </w:rPr>
-        <w:t xml:space="preserve">Der Arbeitsstand liegt seit dem 19.09.2026 in zwei Repositories mit entferntem Spiegel und umfasst zusammen 50 Einträge. Jeder Eintrag trägt eine Beschreibung in ganzen Sätzen, sodass die Einträge zugleich als Protokoll des Projektverlaufs dienen.</w:t>
+        <w:t xml:space="preserve">Der Arbeitsstand liegt seit dem 19.09.2026 in zwei Repositories mit entferntem Spiegel und umfasst bis zum 01.10.2026 zusammen 194 Einträge. Bis auf 17 Einträge vom 01.10.2026, die nur aus einer Betreffzeile bestehen, trägt jeder eine Beschreibung in ganzen Sätzen, sodass die Einträge zugleich als Protokoll des Projektverlaufs dienen.</w:t>
       </w:r>
     </w:p>
     <w:p>
@@ -13581,7 +14472,7 @@
           <w:sz w:val="22"/>
           <w:szCs w:val="22"/>
         </w:rPr>
-        <w:t xml:space="preserve"> Eine laufende Erfassung in Stunden wurde nicht geführt. Sie ließ sich nachträglich aus den Sitzungsprotokollen der in Abschnitt 5.1 genannten Entwicklungsumgebung ableiten, in denen jede Eingabe, jede Ausgabe und jeder Werkzeugaufruf einen Zeitstempel trägt. Die hohe Zahl der Einträge erklärt sich daraus, dass nicht nur Eingaben des Verfassers, sondern auch jede Ausgabe und jeder Werkzeugaufruf einzeln vermerkt werden. Ausgewertet wurden 61.877 Zeitstempel bis zum 25.09.2026, 16:21 Uhr. Zwei aufeinanderfolgende Einträge gelten als derselbe Arbeitsblock, wenn zwischen ihnen höchstens 30 Minuten liegen, während eine größere Lücke die Blöcke voneinander trennt. Die Dauer eines Blocks ergibt sich aus dem Abstand zwischen seinem ersten und seinem letzten Eintrag.</w:t>
+        <w:t xml:space="preserve"> Eine laufende Erfassung in Stunden wurde nicht geführt. Sie ließ sich nachträglich aus den Sitzungsprotokollen der in Abschnitt 5.1 genannten Entwicklungsumgebung ableiten, in denen jede Eingabe, jede Ausgabe und jeder Werkzeugaufruf einen Zeitstempel trägt. Die hohe Zahl der Einträge erklärt sich daraus, dass nicht nur Eingaben des Verfassers, sondern auch jede Ausgabe und jeder Werkzeugaufruf einzeln vermerkt werden. Ausgewertet wurden 85.945 Zeitstempel bis zum 01.10.2026, 23:47 Uhr. Zwei aufeinanderfolgende Einträge gelten als derselbe Arbeitsblock, wenn zwischen ihnen höchstens 30 Minuten liegen, während eine größere Lücke die Blöcke voneinander trennt. Die Dauer eines Blocks ergibt sich aus dem Abstand zwischen seinem ersten und seinem letzten Eintrag.</w:t>
       </w:r>
     </w:p>
     <w:tbl>
@@ -15358,7 +16249,7 @@
                 <w:sz w:val="18"/>
                 <w:szCs w:val="18"/>
               </w:rPr>
-              <w:t xml:space="preserve">2,9</w:t>
+              <w:t xml:space="preserve">5,0</w:t>
             </w:r>
           </w:p>
         </w:tc>
@@ -15387,7 +16278,7 @@
                 <w:sz w:val="18"/>
                 <w:szCs w:val="18"/>
               </w:rPr>
-              <w:t xml:space="preserve">–</w:t>
+              <w:t xml:space="preserve">19</w:t>
             </w:r>
           </w:p>
         </w:tc>
@@ -15416,7 +16307,7 @@
                 <w:sz w:val="18"/>
                 <w:szCs w:val="18"/>
               </w:rPr>
-              <w:t xml:space="preserve">Konzeptfindung, Risikoanalyse, Projektdurchführung (Tag nicht abgeschlossen)</w:t>
+              <w:t xml:space="preserve">Konzeptfindung, Risikoanalyse, Projektdurchführung, Prüfplan und erste Prüfdurchläufe</w:t>
             </w:r>
           </w:p>
         </w:tc>
@@ -15444,6 +16335,732 @@
             <w:r>
               <w:rPr>
                 <w:rFonts w:ascii="Calibri" w:cs="Calibri" w:eastAsia="Calibri" w:hAnsi="Calibri"/>
+                <w:b w:val="false"/>
+                <w:bCs w:val="false"/>
+                <w:color w:val="000000"/>
+                <w:sz w:val="18"/>
+                <w:szCs w:val="18"/>
+              </w:rPr>
+              <w:t xml:space="preserve">26.09.2026</w:t>
+            </w:r>
+          </w:p>
+        </w:tc>
+        <w:tc>
+          <w:tcPr>
+            <w:tcW w:type="pct" w:w="10%"/>
+            <w:tcMar>
+              <w:top w:type="dxa" w:w="60"/>
+              <w:left w:type="dxa" w:w="90"/>
+              <w:bottom w:type="dxa" w:w="60"/>
+              <w:right w:type="dxa" w:w="90"/>
+            </w:tcMar>
+            <w:vAlign w:val="center"/>
+          </w:tcPr>
+          <w:p>
+            <w:pPr>
+              <w:spacing w:after="0" w:line="240"/>
+              <w:jc w:val="center"/>
+            </w:pPr>
+            <w:r>
+              <w:rPr>
+                <w:rFonts w:ascii="Calibri" w:cs="Calibri" w:eastAsia="Calibri" w:hAnsi="Calibri"/>
+                <w:b w:val="false"/>
+                <w:bCs w:val="false"/>
+                <w:color w:val="000000"/>
+                <w:sz w:val="18"/>
+                <w:szCs w:val="18"/>
+              </w:rPr>
+              <w:t xml:space="preserve">9,4</w:t>
+            </w:r>
+          </w:p>
+        </w:tc>
+        <w:tc>
+          <w:tcPr>
+            <w:tcW w:type="pct" w:w="10%"/>
+            <w:tcMar>
+              <w:top w:type="dxa" w:w="60"/>
+              <w:left w:type="dxa" w:w="90"/>
+              <w:bottom w:type="dxa" w:w="60"/>
+              <w:right w:type="dxa" w:w="90"/>
+            </w:tcMar>
+            <w:vAlign w:val="center"/>
+          </w:tcPr>
+          <w:p>
+            <w:pPr>
+              <w:spacing w:after="0" w:line="240"/>
+              <w:jc w:val="center"/>
+            </w:pPr>
+            <w:r>
+              <w:rPr>
+                <w:rFonts w:ascii="Calibri" w:cs="Calibri" w:eastAsia="Calibri" w:hAnsi="Calibri"/>
+                <w:b w:val="false"/>
+                <w:bCs w:val="false"/>
+                <w:color w:val="000000"/>
+                <w:sz w:val="18"/>
+                <w:szCs w:val="18"/>
+              </w:rPr>
+              <w:t xml:space="preserve">26</w:t>
+            </w:r>
+          </w:p>
+        </w:tc>
+        <w:tc>
+          <w:tcPr>
+            <w:tcW w:type="pct" w:w="69%"/>
+            <w:tcMar>
+              <w:top w:type="dxa" w:w="60"/>
+              <w:left w:type="dxa" w:w="90"/>
+              <w:bottom w:type="dxa" w:w="60"/>
+              <w:right w:type="dxa" w:w="90"/>
+            </w:tcMar>
+            <w:vAlign w:val="center"/>
+          </w:tcPr>
+          <w:p>
+            <w:pPr>
+              <w:spacing w:after="0" w:line="240"/>
+              <w:jc w:val="left"/>
+            </w:pPr>
+            <w:r>
+              <w:rPr>
+                <w:rFonts w:ascii="Calibri" w:cs="Calibri" w:eastAsia="Calibri" w:hAnsi="Calibri"/>
+                <w:b w:val="false"/>
+                <w:bCs w:val="false"/>
+                <w:color w:val="000000"/>
+                <w:sz w:val="18"/>
+                <w:szCs w:val="18"/>
+              </w:rPr>
+              <w:t xml:space="preserve">Sechs Änderungsskripte angewandt, Tonspur nachgebessert, Wortschatz auf 63 Level in neun Sektionen erweitert</w:t>
+            </w:r>
+          </w:p>
+        </w:tc>
+      </w:tr>
+      <w:tr>
+        <w:trPr>
+          <w:cantSplit/>
+        </w:trPr>
+        <w:tc>
+          <w:tcPr>
+            <w:tcW w:type="pct" w:w="11%"/>
+            <w:tcMar>
+              <w:top w:type="dxa" w:w="60"/>
+              <w:left w:type="dxa" w:w="90"/>
+              <w:bottom w:type="dxa" w:w="60"/>
+              <w:right w:type="dxa" w:w="90"/>
+            </w:tcMar>
+            <w:vAlign w:val="center"/>
+          </w:tcPr>
+          <w:p>
+            <w:pPr>
+              <w:spacing w:after="0" w:line="240"/>
+              <w:jc w:val="center"/>
+            </w:pPr>
+            <w:r>
+              <w:rPr>
+                <w:rFonts w:ascii="Calibri" w:cs="Calibri" w:eastAsia="Calibri" w:hAnsi="Calibri"/>
+                <w:b w:val="false"/>
+                <w:bCs w:val="false"/>
+                <w:color w:val="000000"/>
+                <w:sz w:val="18"/>
+                <w:szCs w:val="18"/>
+              </w:rPr>
+              <w:t xml:space="preserve">27.09.2026</w:t>
+            </w:r>
+          </w:p>
+        </w:tc>
+        <w:tc>
+          <w:tcPr>
+            <w:tcW w:type="pct" w:w="10%"/>
+            <w:tcMar>
+              <w:top w:type="dxa" w:w="60"/>
+              <w:left w:type="dxa" w:w="90"/>
+              <w:bottom w:type="dxa" w:w="60"/>
+              <w:right w:type="dxa" w:w="90"/>
+            </w:tcMar>
+            <w:vAlign w:val="center"/>
+          </w:tcPr>
+          <w:p>
+            <w:pPr>
+              <w:spacing w:after="0" w:line="240"/>
+              <w:jc w:val="center"/>
+            </w:pPr>
+            <w:r>
+              <w:rPr>
+                <w:rFonts w:ascii="Calibri" w:cs="Calibri" w:eastAsia="Calibri" w:hAnsi="Calibri"/>
+                <w:b w:val="false"/>
+                <w:bCs w:val="false"/>
+                <w:color w:val="000000"/>
+                <w:sz w:val="18"/>
+                <w:szCs w:val="18"/>
+              </w:rPr>
+              <w:t xml:space="preserve">6,1</w:t>
+            </w:r>
+          </w:p>
+        </w:tc>
+        <w:tc>
+          <w:tcPr>
+            <w:tcW w:type="pct" w:w="10%"/>
+            <w:tcMar>
+              <w:top w:type="dxa" w:w="60"/>
+              <w:left w:type="dxa" w:w="90"/>
+              <w:bottom w:type="dxa" w:w="60"/>
+              <w:right w:type="dxa" w:w="90"/>
+            </w:tcMar>
+            <w:vAlign w:val="center"/>
+          </w:tcPr>
+          <w:p>
+            <w:pPr>
+              <w:spacing w:after="0" w:line="240"/>
+              <w:jc w:val="center"/>
+            </w:pPr>
+            <w:r>
+              <w:rPr>
+                <w:rFonts w:ascii="Calibri" w:cs="Calibri" w:eastAsia="Calibri" w:hAnsi="Calibri"/>
+                <w:b w:val="false"/>
+                <w:bCs w:val="false"/>
+                <w:color w:val="000000"/>
+                <w:sz w:val="18"/>
+                <w:szCs w:val="18"/>
+              </w:rPr>
+              <w:t xml:space="preserve">19</w:t>
+            </w:r>
+          </w:p>
+        </w:tc>
+        <w:tc>
+          <w:tcPr>
+            <w:tcW w:type="pct" w:w="69%"/>
+            <w:tcMar>
+              <w:top w:type="dxa" w:w="60"/>
+              <w:left w:type="dxa" w:w="90"/>
+              <w:bottom w:type="dxa" w:w="60"/>
+              <w:right w:type="dxa" w:w="90"/>
+            </w:tcMar>
+            <w:vAlign w:val="center"/>
+          </w:tcPr>
+          <w:p>
+            <w:pPr>
+              <w:spacing w:after="0" w:line="240"/>
+              <w:jc w:val="left"/>
+            </w:pPr>
+            <w:r>
+              <w:rPr>
+                <w:rFonts w:ascii="Calibri" w:cs="Calibri" w:eastAsia="Calibri" w:hAnsi="Calibri"/>
+                <w:b w:val="false"/>
+                <w:bCs w:val="false"/>
+                <w:color w:val="000000"/>
+                <w:sz w:val="18"/>
+                <w:szCs w:val="18"/>
+              </w:rPr>
+              <w:t xml:space="preserve">Übersetzungen und Lückensätze der neuen Level, neun Sektionsfarben, Werbung nach jeder Lektion</w:t>
+            </w:r>
+          </w:p>
+        </w:tc>
+      </w:tr>
+      <w:tr>
+        <w:trPr>
+          <w:cantSplit/>
+        </w:trPr>
+        <w:tc>
+          <w:tcPr>
+            <w:tcW w:type="pct" w:w="11%"/>
+            <w:tcMar>
+              <w:top w:type="dxa" w:w="60"/>
+              <w:left w:type="dxa" w:w="90"/>
+              <w:bottom w:type="dxa" w:w="60"/>
+              <w:right w:type="dxa" w:w="90"/>
+            </w:tcMar>
+            <w:vAlign w:val="center"/>
+          </w:tcPr>
+          <w:p>
+            <w:pPr>
+              <w:spacing w:after="0" w:line="240"/>
+              <w:jc w:val="center"/>
+            </w:pPr>
+            <w:r>
+              <w:rPr>
+                <w:rFonts w:ascii="Calibri" w:cs="Calibri" w:eastAsia="Calibri" w:hAnsi="Calibri"/>
+                <w:b w:val="false"/>
+                <w:bCs w:val="false"/>
+                <w:color w:val="000000"/>
+                <w:sz w:val="18"/>
+                <w:szCs w:val="18"/>
+              </w:rPr>
+              <w:t xml:space="preserve">28.09.2026</w:t>
+            </w:r>
+          </w:p>
+        </w:tc>
+        <w:tc>
+          <w:tcPr>
+            <w:tcW w:type="pct" w:w="10%"/>
+            <w:tcMar>
+              <w:top w:type="dxa" w:w="60"/>
+              <w:left w:type="dxa" w:w="90"/>
+              <w:bottom w:type="dxa" w:w="60"/>
+              <w:right w:type="dxa" w:w="90"/>
+            </w:tcMar>
+            <w:vAlign w:val="center"/>
+          </w:tcPr>
+          <w:p>
+            <w:pPr>
+              <w:spacing w:after="0" w:line="240"/>
+              <w:jc w:val="center"/>
+            </w:pPr>
+            <w:r>
+              <w:rPr>
+                <w:rFonts w:ascii="Calibri" w:cs="Calibri" w:eastAsia="Calibri" w:hAnsi="Calibri"/>
+                <w:b w:val="false"/>
+                <w:bCs w:val="false"/>
+                <w:color w:val="000000"/>
+                <w:sz w:val="18"/>
+                <w:szCs w:val="18"/>
+              </w:rPr>
+              <w:t xml:space="preserve">2,6</w:t>
+            </w:r>
+          </w:p>
+        </w:tc>
+        <w:tc>
+          <w:tcPr>
+            <w:tcW w:type="pct" w:w="10%"/>
+            <w:tcMar>
+              <w:top w:type="dxa" w:w="60"/>
+              <w:left w:type="dxa" w:w="90"/>
+              <w:bottom w:type="dxa" w:w="60"/>
+              <w:right w:type="dxa" w:w="90"/>
+            </w:tcMar>
+            <w:vAlign w:val="center"/>
+          </w:tcPr>
+          <w:p>
+            <w:pPr>
+              <w:spacing w:after="0" w:line="240"/>
+              <w:jc w:val="center"/>
+            </w:pPr>
+            <w:r>
+              <w:rPr>
+                <w:rFonts w:ascii="Calibri" w:cs="Calibri" w:eastAsia="Calibri" w:hAnsi="Calibri"/>
+                <w:b w:val="false"/>
+                <w:bCs w:val="false"/>
+                <w:color w:val="000000"/>
+                <w:sz w:val="18"/>
+                <w:szCs w:val="18"/>
+              </w:rPr>
+              <w:t xml:space="preserve">9</w:t>
+            </w:r>
+          </w:p>
+        </w:tc>
+        <w:tc>
+          <w:tcPr>
+            <w:tcW w:type="pct" w:w="69%"/>
+            <w:tcMar>
+              <w:top w:type="dxa" w:w="60"/>
+              <w:left w:type="dxa" w:w="90"/>
+              <w:bottom w:type="dxa" w:w="60"/>
+              <w:right w:type="dxa" w:w="90"/>
+            </w:tcMar>
+            <w:vAlign w:val="center"/>
+          </w:tcPr>
+          <w:p>
+            <w:pPr>
+              <w:spacing w:after="0" w:line="240"/>
+              <w:jc w:val="left"/>
+            </w:pPr>
+            <w:r>
+              <w:rPr>
+                <w:rFonts w:ascii="Calibri" w:cs="Calibri" w:eastAsia="Calibri" w:hAnsi="Calibri"/>
+                <w:b w:val="false"/>
+                <w:bCs w:val="false"/>
+                <w:color w:val="000000"/>
+                <w:sz w:val="18"/>
+                <w:szCs w:val="18"/>
+              </w:rPr>
+              <w:t xml:space="preserve">Prüfdurchläufe auf dem Gerät: Leben, Abonnement, Betrieb ohne Netz, Einwilligung, Mikrofon, acht Sprachen</w:t>
+            </w:r>
+          </w:p>
+        </w:tc>
+      </w:tr>
+      <w:tr>
+        <w:trPr>
+          <w:cantSplit/>
+        </w:trPr>
+        <w:tc>
+          <w:tcPr>
+            <w:tcW w:type="pct" w:w="11%"/>
+            <w:tcMar>
+              <w:top w:type="dxa" w:w="60"/>
+              <w:left w:type="dxa" w:w="90"/>
+              <w:bottom w:type="dxa" w:w="60"/>
+              <w:right w:type="dxa" w:w="90"/>
+            </w:tcMar>
+            <w:vAlign w:val="center"/>
+          </w:tcPr>
+          <w:p>
+            <w:pPr>
+              <w:spacing w:after="0" w:line="240"/>
+              <w:jc w:val="center"/>
+            </w:pPr>
+            <w:r>
+              <w:rPr>
+                <w:rFonts w:ascii="Calibri" w:cs="Calibri" w:eastAsia="Calibri" w:hAnsi="Calibri"/>
+                <w:b w:val="false"/>
+                <w:bCs w:val="false"/>
+                <w:color w:val="000000"/>
+                <w:sz w:val="18"/>
+                <w:szCs w:val="18"/>
+              </w:rPr>
+              <w:t xml:space="preserve">29.09.2026</w:t>
+            </w:r>
+          </w:p>
+        </w:tc>
+        <w:tc>
+          <w:tcPr>
+            <w:tcW w:type="pct" w:w="10%"/>
+            <w:tcMar>
+              <w:top w:type="dxa" w:w="60"/>
+              <w:left w:type="dxa" w:w="90"/>
+              <w:bottom w:type="dxa" w:w="60"/>
+              <w:right w:type="dxa" w:w="90"/>
+            </w:tcMar>
+            <w:vAlign w:val="center"/>
+          </w:tcPr>
+          <w:p>
+            <w:pPr>
+              <w:spacing w:after="0" w:line="240"/>
+              <w:jc w:val="center"/>
+            </w:pPr>
+            <w:r>
+              <w:rPr>
+                <w:rFonts w:ascii="Calibri" w:cs="Calibri" w:eastAsia="Calibri" w:hAnsi="Calibri"/>
+                <w:b w:val="false"/>
+                <w:bCs w:val="false"/>
+                <w:color w:val="000000"/>
+                <w:sz w:val="18"/>
+                <w:szCs w:val="18"/>
+              </w:rPr>
+              <w:t xml:space="preserve">3,7</w:t>
+            </w:r>
+          </w:p>
+        </w:tc>
+        <w:tc>
+          <w:tcPr>
+            <w:tcW w:type="pct" w:w="10%"/>
+            <w:tcMar>
+              <w:top w:type="dxa" w:w="60"/>
+              <w:left w:type="dxa" w:w="90"/>
+              <w:bottom w:type="dxa" w:w="60"/>
+              <w:right w:type="dxa" w:w="90"/>
+            </w:tcMar>
+            <w:vAlign w:val="center"/>
+          </w:tcPr>
+          <w:p>
+            <w:pPr>
+              <w:spacing w:after="0" w:line="240"/>
+              <w:jc w:val="center"/>
+            </w:pPr>
+            <w:r>
+              <w:rPr>
+                <w:rFonts w:ascii="Calibri" w:cs="Calibri" w:eastAsia="Calibri" w:hAnsi="Calibri"/>
+                <w:b w:val="false"/>
+                <w:bCs w:val="false"/>
+                <w:color w:val="000000"/>
+                <w:sz w:val="18"/>
+                <w:szCs w:val="18"/>
+              </w:rPr>
+              <w:t xml:space="preserve">18</w:t>
+            </w:r>
+          </w:p>
+        </w:tc>
+        <w:tc>
+          <w:tcPr>
+            <w:tcW w:type="pct" w:w="69%"/>
+            <w:tcMar>
+              <w:top w:type="dxa" w:w="60"/>
+              <w:left w:type="dxa" w:w="90"/>
+              <w:bottom w:type="dxa" w:w="60"/>
+              <w:right w:type="dxa" w:w="90"/>
+            </w:tcMar>
+            <w:vAlign w:val="center"/>
+          </w:tcPr>
+          <w:p>
+            <w:pPr>
+              <w:spacing w:after="0" w:line="240"/>
+              <w:jc w:val="left"/>
+            </w:pPr>
+            <w:r>
+              <w:rPr>
+                <w:rFonts w:ascii="Calibri" w:cs="Calibri" w:eastAsia="Calibri" w:hAnsi="Calibri"/>
+                <w:b w:val="false"/>
+                <w:bCs w:val="false"/>
+                <w:color w:val="000000"/>
+                <w:sz w:val="18"/>
+                <w:szCs w:val="18"/>
+              </w:rPr>
+              <w:t xml:space="preserve">Drei kontogefährdende Werbebefunde behoben, Ausstattung für die Vollversion, Lernstand auf ein zweites Gerät übertragen</w:t>
+            </w:r>
+          </w:p>
+        </w:tc>
+      </w:tr>
+      <w:tr>
+        <w:trPr>
+          <w:cantSplit/>
+        </w:trPr>
+        <w:tc>
+          <w:tcPr>
+            <w:tcW w:type="pct" w:w="11%"/>
+            <w:tcMar>
+              <w:top w:type="dxa" w:w="60"/>
+              <w:left w:type="dxa" w:w="90"/>
+              <w:bottom w:type="dxa" w:w="60"/>
+              <w:right w:type="dxa" w:w="90"/>
+            </w:tcMar>
+            <w:vAlign w:val="center"/>
+          </w:tcPr>
+          <w:p>
+            <w:pPr>
+              <w:spacing w:after="0" w:line="240"/>
+              <w:jc w:val="center"/>
+            </w:pPr>
+            <w:r>
+              <w:rPr>
+                <w:rFonts w:ascii="Calibri" w:cs="Calibri" w:eastAsia="Calibri" w:hAnsi="Calibri"/>
+                <w:b w:val="false"/>
+                <w:bCs w:val="false"/>
+                <w:color w:val="000000"/>
+                <w:sz w:val="18"/>
+                <w:szCs w:val="18"/>
+              </w:rPr>
+              <w:t xml:space="preserve">30.09.2026</w:t>
+            </w:r>
+          </w:p>
+        </w:tc>
+        <w:tc>
+          <w:tcPr>
+            <w:tcW w:type="pct" w:w="10%"/>
+            <w:tcMar>
+              <w:top w:type="dxa" w:w="60"/>
+              <w:left w:type="dxa" w:w="90"/>
+              <w:bottom w:type="dxa" w:w="60"/>
+              <w:right w:type="dxa" w:w="90"/>
+            </w:tcMar>
+            <w:vAlign w:val="center"/>
+          </w:tcPr>
+          <w:p>
+            <w:pPr>
+              <w:spacing w:after="0" w:line="240"/>
+              <w:jc w:val="center"/>
+            </w:pPr>
+            <w:r>
+              <w:rPr>
+                <w:rFonts w:ascii="Calibri" w:cs="Calibri" w:eastAsia="Calibri" w:hAnsi="Calibri"/>
+                <w:b w:val="false"/>
+                <w:bCs w:val="false"/>
+                <w:color w:val="000000"/>
+                <w:sz w:val="18"/>
+                <w:szCs w:val="18"/>
+              </w:rPr>
+              <w:t xml:space="preserve">5,1</w:t>
+            </w:r>
+          </w:p>
+        </w:tc>
+        <w:tc>
+          <w:tcPr>
+            <w:tcW w:type="pct" w:w="10%"/>
+            <w:tcMar>
+              <w:top w:type="dxa" w:w="60"/>
+              <w:left w:type="dxa" w:w="90"/>
+              <w:bottom w:type="dxa" w:w="60"/>
+              <w:right w:type="dxa" w:w="90"/>
+            </w:tcMar>
+            <w:vAlign w:val="center"/>
+          </w:tcPr>
+          <w:p>
+            <w:pPr>
+              <w:spacing w:after="0" w:line="240"/>
+              <w:jc w:val="center"/>
+            </w:pPr>
+            <w:r>
+              <w:rPr>
+                <w:rFonts w:ascii="Calibri" w:cs="Calibri" w:eastAsia="Calibri" w:hAnsi="Calibri"/>
+                <w:b w:val="false"/>
+                <w:bCs w:val="false"/>
+                <w:color w:val="000000"/>
+                <w:sz w:val="18"/>
+                <w:szCs w:val="18"/>
+              </w:rPr>
+              <w:t xml:space="preserve">18</w:t>
+            </w:r>
+          </w:p>
+        </w:tc>
+        <w:tc>
+          <w:tcPr>
+            <w:tcW w:type="pct" w:w="69%"/>
+            <w:tcMar>
+              <w:top w:type="dxa" w:w="60"/>
+              <w:left w:type="dxa" w:w="90"/>
+              <w:bottom w:type="dxa" w:w="60"/>
+              <w:right w:type="dxa" w:w="90"/>
+            </w:tcMar>
+            <w:vAlign w:val="center"/>
+          </w:tcPr>
+          <w:p>
+            <w:pPr>
+              <w:spacing w:after="0" w:line="240"/>
+              <w:jc w:val="left"/>
+            </w:pPr>
+            <w:r>
+              <w:rPr>
+                <w:rFonts w:ascii="Calibri" w:cs="Calibri" w:eastAsia="Calibri" w:hAnsi="Calibri"/>
+                <w:b w:val="false"/>
+                <w:bCs w:val="false"/>
+                <w:color w:val="000000"/>
+                <w:sz w:val="18"/>
+                <w:szCs w:val="18"/>
+              </w:rPr>
+              <w:t xml:space="preserve">Übrige Werbebefunde behoben, Kennung der Testgeräte, Einstufungstest und Reiter Wiederholen</w:t>
+            </w:r>
+          </w:p>
+        </w:tc>
+      </w:tr>
+      <w:tr>
+        <w:trPr>
+          <w:cantSplit/>
+        </w:trPr>
+        <w:tc>
+          <w:tcPr>
+            <w:tcW w:type="pct" w:w="11%"/>
+            <w:tcMar>
+              <w:top w:type="dxa" w:w="60"/>
+              <w:left w:type="dxa" w:w="90"/>
+              <w:bottom w:type="dxa" w:w="60"/>
+              <w:right w:type="dxa" w:w="90"/>
+            </w:tcMar>
+            <w:vAlign w:val="center"/>
+          </w:tcPr>
+          <w:p>
+            <w:pPr>
+              <w:spacing w:after="0" w:line="240"/>
+              <w:jc w:val="center"/>
+            </w:pPr>
+            <w:r>
+              <w:rPr>
+                <w:rFonts w:ascii="Calibri" w:cs="Calibri" w:eastAsia="Calibri" w:hAnsi="Calibri"/>
+                <w:b w:val="false"/>
+                <w:bCs w:val="false"/>
+                <w:color w:val="000000"/>
+                <w:sz w:val="18"/>
+                <w:szCs w:val="18"/>
+              </w:rPr>
+              <w:t xml:space="preserve">01.10.2026</w:t>
+            </w:r>
+          </w:p>
+        </w:tc>
+        <w:tc>
+          <w:tcPr>
+            <w:tcW w:type="pct" w:w="10%"/>
+            <w:tcMar>
+              <w:top w:type="dxa" w:w="60"/>
+              <w:left w:type="dxa" w:w="90"/>
+              <w:bottom w:type="dxa" w:w="60"/>
+              <w:right w:type="dxa" w:w="90"/>
+            </w:tcMar>
+            <w:vAlign w:val="center"/>
+          </w:tcPr>
+          <w:p>
+            <w:pPr>
+              <w:spacing w:after="0" w:line="240"/>
+              <w:jc w:val="center"/>
+            </w:pPr>
+            <w:r>
+              <w:rPr>
+                <w:rFonts w:ascii="Calibri" w:cs="Calibri" w:eastAsia="Calibri" w:hAnsi="Calibri"/>
+                <w:b w:val="false"/>
+                <w:bCs w:val="false"/>
+                <w:color w:val="000000"/>
+                <w:sz w:val="18"/>
+                <w:szCs w:val="18"/>
+              </w:rPr>
+              <w:t xml:space="preserve">8,1</w:t>
+            </w:r>
+          </w:p>
+        </w:tc>
+        <w:tc>
+          <w:tcPr>
+            <w:tcW w:type="pct" w:w="10%"/>
+            <w:tcMar>
+              <w:top w:type="dxa" w:w="60"/>
+              <w:left w:type="dxa" w:w="90"/>
+              <w:bottom w:type="dxa" w:w="60"/>
+              <w:right w:type="dxa" w:w="90"/>
+            </w:tcMar>
+            <w:vAlign w:val="center"/>
+          </w:tcPr>
+          <w:p>
+            <w:pPr>
+              <w:spacing w:after="0" w:line="240"/>
+              <w:jc w:val="center"/>
+            </w:pPr>
+            <w:r>
+              <w:rPr>
+                <w:rFonts w:ascii="Calibri" w:cs="Calibri" w:eastAsia="Calibri" w:hAnsi="Calibri"/>
+                <w:b w:val="false"/>
+                <w:bCs w:val="false"/>
+                <w:color w:val="000000"/>
+                <w:sz w:val="18"/>
+                <w:szCs w:val="18"/>
+              </w:rPr>
+              <w:t xml:space="preserve">35</w:t>
+            </w:r>
+          </w:p>
+        </w:tc>
+        <w:tc>
+          <w:tcPr>
+            <w:tcW w:type="pct" w:w="69%"/>
+            <w:tcMar>
+              <w:top w:type="dxa" w:w="60"/>
+              <w:left w:type="dxa" w:w="90"/>
+              <w:bottom w:type="dxa" w:w="60"/>
+              <w:right w:type="dxa" w:w="90"/>
+            </w:tcMar>
+            <w:vAlign w:val="center"/>
+          </w:tcPr>
+          <w:p>
+            <w:pPr>
+              <w:spacing w:after="0" w:line="240"/>
+              <w:jc w:val="left"/>
+            </w:pPr>
+            <w:r>
+              <w:rPr>
+                <w:rFonts w:ascii="Calibri" w:cs="Calibri" w:eastAsia="Calibri" w:hAnsi="Calibri"/>
+                <w:b w:val="false"/>
+                <w:bCs w:val="false"/>
+                <w:color w:val="000000"/>
+                <w:sz w:val="18"/>
+                <w:szCs w:val="18"/>
+              </w:rPr>
+              <w:t xml:space="preserve">Bewertung und Erinnerungen, Technik-Wortschatz, damit 65 Level, Festtage, neue Store-Bilder, Paket für die Produktion</w:t>
+            </w:r>
+          </w:p>
+        </w:tc>
+      </w:tr>
+      <w:tr>
+        <w:trPr>
+          <w:cantSplit/>
+        </w:trPr>
+        <w:tc>
+          <w:tcPr>
+            <w:tcW w:type="pct" w:w="11%"/>
+            <w:tcMar>
+              <w:top w:type="dxa" w:w="60"/>
+              <w:left w:type="dxa" w:w="90"/>
+              <w:bottom w:type="dxa" w:w="60"/>
+              <w:right w:type="dxa" w:w="90"/>
+            </w:tcMar>
+            <w:vAlign w:val="center"/>
+          </w:tcPr>
+          <w:p>
+            <w:pPr>
+              <w:spacing w:after="0" w:line="240"/>
+              <w:jc w:val="center"/>
+            </w:pPr>
+            <w:r>
+              <w:rPr>
+                <w:rFonts w:ascii="Calibri" w:cs="Calibri" w:eastAsia="Calibri" w:hAnsi="Calibri"/>
                 <w:b/>
                 <w:bCs/>
                 <w:color w:val="000000"/>
@@ -15479,7 +17096,7 @@
                 <w:sz w:val="18"/>
                 <w:szCs w:val="18"/>
               </w:rPr>
-              <w:t xml:space="preserve">55,9</w:t>
+              <w:t xml:space="preserve">92,9</w:t>
             </w:r>
           </w:p>
         </w:tc>
@@ -15508,7 +17125,7 @@
                 <w:sz w:val="18"/>
                 <w:szCs w:val="18"/>
               </w:rPr>
-              <w:t xml:space="preserve">50</w:t>
+              <w:t xml:space="preserve">194</w:t>
             </w:r>
           </w:p>
         </w:tc>
@@ -15537,7 +17154,7 @@
                 <w:sz w:val="18"/>
                 <w:szCs w:val="18"/>
               </w:rPr>
-              <w:t xml:space="preserve">13 Arbeitstage bei 30-Minuten-Schwelle; im Mittel 4,3 Stunden je Tag</w:t>
+              <w:t xml:space="preserve">19 Arbeitstage bei 30-Minuten-Schwelle; im Mittel 4,9 Stunden je Tag</w:t>
             </w:r>
           </w:p>
         </w:tc>
@@ -15597,7 +17214,7 @@
           <w:sz w:val="22"/>
           <w:szCs w:val="22"/>
         </w:rPr>
-        <w:t xml:space="preserve"> Es hängt von der gewählten Pausenschwelle ab: Bei 5 Minuten ergeben sich 37,9 Stunden, bei 15 Minuten 52,2, bei 30 Minuten 55,9, bei 60 Minuten 61,2. Belastbar ist der Bereich zwischen 15 und 60 Minuten. Eine Schwelle von 5 Minuten trennt bereits beim Lesen eines Ergebnisses, und eine Schwelle von mehr als einer Stunde zählt echte Abwesenheit mit. Der Aufwand beträgt danach </w:t>
+        <w:t xml:space="preserve"> Es hängt von der gewählten Pausenschwelle ab: Bei 5 Minuten ergeben sich 66,1 Stunden, bei 15 Minuten 86,0, bei 30 Minuten 92,9, bei 60 Minuten 103,8. Belastbar ist der Bereich zwischen 15 und 60 Minuten. Eine Schwelle von 5 Minuten trennt bereits beim Lesen eines Ergebnisses, und eine Schwelle von mehr als einer Stunde zählt echte Abwesenheit mit. Der Aufwand beträgt danach </w:t>
       </w:r>
       <w:r>
         <w:rPr>
@@ -15607,7 +17224,7 @@
           <w:sz w:val="22"/>
           <w:szCs w:val="22"/>
         </w:rPr>
-        <w:t xml:space="preserve">rund 52 bis 61 Stunden</w:t>
+        <w:t xml:space="preserve">rund 86 bis 104 Stunden</w:t>
       </w:r>
       <w:r>
         <w:rPr>
@@ -15617,7 +17234,7 @@
           <w:sz w:val="22"/>
           <w:szCs w:val="22"/>
         </w:rPr>
-        <w:t xml:space="preserve">, wobei die Tabelle 55,9 bei der gewählten Schwelle von 30 Minuten ausweist.</w:t>
+        <w:t xml:space="preserve">, wobei die Tabelle 92,9 bei der gewählten Schwelle von 30 Minuten ausweist.</w:t>
       </w:r>
     </w:p>
     <w:p>
@@ -15633,7 +17250,7 @@
           <w:sz w:val="22"/>
           <w:szCs w:val="22"/>
         </w:rPr>
-        <w:t xml:space="preserve">Die 30 Minuten sind nicht beliebig gesetzt. Von den 154 Lücken über fünf Minuten liegen 105 unter einer Viertelstunde und 30 über einer Stunde, dazwischen sind es 19. Die Verteilung weist damit zwei Häufungen auf, nämlich kurze Unterbrechungen und echte Pausen, sodass die Schwelle an der dünn besetzten Stelle dazwischen trennt.</w:t>
+        <w:t xml:space="preserve">Die 30 Minuten sind nicht beliebig gesetzt. Von den 225 Lücken über fünf Minuten liegen 147 unter einer Viertelstunde und 41 über einer Stunde, dazwischen sind es 37. Die Verteilung weist damit zwei Häufungen auf, nämlich kurze Unterbrechungen und echte Pausen, sodass die Schwelle an der dünn besetzten Stelle dazwischen trennt.</w:t>
       </w:r>
     </w:p>
     <w:p>
@@ -15649,7 +17266,7 @@
           <w:sz w:val="22"/>
           <w:szCs w:val="22"/>
         </w:rPr>
-        <w:t xml:space="preserve">Rund ein Drittel der Summe ist belegfreie Zeit.</w:t>
+        <w:t xml:space="preserve">Mehr als ein Viertel der Summe ist belegfreie Zeit.</w:t>
       </w:r>
       <w:r>
         <w:rPr>
@@ -15659,7 +17276,7 @@
           <w:sz w:val="22"/>
           <w:szCs w:val="22"/>
         </w:rPr>
-        <w:t xml:space="preserve"> 116 Lücken von mindestens fünf Minuten liegen innerhalb der Blöcke und werden voll mitgezählt, was zusammen 17,9 Stunden oder 32,1 Prozent ausmacht. Ob in dieser Zeit ein Ergebnis gelesen, auf dem Gerät geprüft oder pausiert wurde, geht aus den Protokollen nicht hervor.</w:t>
+        <w:t xml:space="preserve"> 168 Lücken von mindestens fünf Minuten liegen innerhalb der Blöcke und werden voll mitgezählt, was zusammen 26,7 Stunden oder 28,8 Prozent ausmacht. Ob in dieser Zeit ein Ergebnis gelesen, auf dem Gerät geprüft oder pausiert wurde, geht aus den Protokollen nicht hervor.</w:t>
       </w:r>
     </w:p>
     <w:p>
@@ -15695,7 +17312,7 @@
           <w:sz w:val="22"/>
           <w:szCs w:val="22"/>
         </w:rPr>
-        <w:t xml:space="preserve">rund 54 Stunden</w:t>
+        <w:t xml:space="preserve">rund 91 Stunden</w:t>
       </w:r>
       <w:r>
         <w:rPr>
@@ -16023,7 +17640,7 @@
                 <w:sz w:val="18"/>
                 <w:szCs w:val="18"/>
               </w:rPr>
-              <w:t xml:space="preserve">07.10.2026</w:t>
+              <w:t xml:space="preserve">01.10.2026</w:t>
             </w:r>
           </w:p>
         </w:tc>
@@ -16052,7 +17669,7 @@
                 <w:sz w:val="18"/>
                 <w:szCs w:val="18"/>
               </w:rPr>
-              <w:t xml:space="preserve">frühester Antrag auf Produktionszugriff</w:t>
+              <w:t xml:space="preserve">Paket für die Produktion signiert, Store-Eintrag als Entwurf vorbereitet</w:t>
             </w:r>
           </w:p>
         </w:tc>
@@ -16086,7 +17703,7 @@
                 <w:sz w:val="18"/>
                 <w:szCs w:val="18"/>
               </w:rPr>
-              <w:t xml:space="preserve">Oktober 2026</w:t>
+              <w:t xml:space="preserve">07.10.2026</w:t>
             </w:r>
           </w:p>
         </w:tc>
@@ -16115,7 +17732,7 @@
                 <w:sz w:val="18"/>
                 <w:szCs w:val="18"/>
               </w:rPr>
-              <w:t xml:space="preserve">Freigabe der Produktionsversion erwartet, Google nennt keine Frist</w:t>
+              <w:t xml:space="preserve">frühester Antrag auf Produktionszugriff</w:t>
             </w:r>
           </w:p>
         </w:tc>
@@ -16149,6 +17766,69 @@
                 <w:sz w:val="18"/>
                 <w:szCs w:val="18"/>
               </w:rPr>
+              <w:t xml:space="preserve">Oktober 2026</w:t>
+            </w:r>
+          </w:p>
+        </w:tc>
+        <w:tc>
+          <w:tcPr>
+            <w:tcW w:type="pct" w:w="76%"/>
+            <w:tcMar>
+              <w:top w:type="dxa" w:w="60"/>
+              <w:left w:type="dxa" w:w="90"/>
+              <w:bottom w:type="dxa" w:w="60"/>
+              <w:right w:type="dxa" w:w="90"/>
+            </w:tcMar>
+            <w:vAlign w:val="center"/>
+          </w:tcPr>
+          <w:p>
+            <w:pPr>
+              <w:spacing w:after="0" w:line="240"/>
+              <w:jc w:val="left"/>
+            </w:pPr>
+            <w:r>
+              <w:rPr>
+                <w:rFonts w:ascii="Calibri" w:cs="Calibri" w:eastAsia="Calibri" w:hAnsi="Calibri"/>
+                <w:b w:val="false"/>
+                <w:bCs w:val="false"/>
+                <w:color w:val="000000"/>
+                <w:sz w:val="18"/>
+                <w:szCs w:val="18"/>
+              </w:rPr>
+              <w:t xml:space="preserve">Freigabe der Produktionsversion erwartet, Google nennt keine Frist</w:t>
+            </w:r>
+          </w:p>
+        </w:tc>
+      </w:tr>
+      <w:tr>
+        <w:trPr>
+          <w:cantSplit/>
+        </w:trPr>
+        <w:tc>
+          <w:tcPr>
+            <w:tcW w:type="pct" w:w="24%"/>
+            <w:tcMar>
+              <w:top w:type="dxa" w:w="60"/>
+              <w:left w:type="dxa" w:w="90"/>
+              <w:bottom w:type="dxa" w:w="60"/>
+              <w:right w:type="dxa" w:w="90"/>
+            </w:tcMar>
+            <w:vAlign w:val="center"/>
+          </w:tcPr>
+          <w:p>
+            <w:pPr>
+              <w:spacing w:after="0" w:line="240"/>
+              <w:jc w:val="left"/>
+            </w:pPr>
+            <w:r>
+              <w:rPr>
+                <w:rFonts w:ascii="Calibri" w:cs="Calibri" w:eastAsia="Calibri" w:hAnsi="Calibri"/>
+                <w:b w:val="false"/>
+                <w:bCs w:val="false"/>
+                <w:color w:val="000000"/>
+                <w:sz w:val="18"/>
+                <w:szCs w:val="18"/>
+              </w:rPr>
               <w:t xml:space="preserve">19.03.2027</w:t>
             </w:r>
           </w:p>
@@ -16212,7 +17892,7 @@
           <w:sz w:val="22"/>
           <w:szCs w:val="22"/>
         </w:rPr>
-        <w:t xml:space="preserve"> Drei Bestände wurden systematisch und nicht stichprobenweise geprüft. Die Prüfung der Werbeeinbindung ergab 20 belegte Befunde, davon drei kontogefährdend. Dazu wurde jeder Befund in einem zweiten Durchgang gezielt angegriffen, um ihn zu widerlegen, und nur die dabei bestätigten Befunde stehen im Bericht. Die Oberfläche umfasst acht Sprachen mit je 396 Texten und wurde Seite für Seite in jeder Sprache durchgesehen. Für eine geplante Erweiterung des Wortschatzes liegen 569 neue Vorschläge vor, die derzeit von einem Muttersprachler durchgesehen werden.</w:t>
+        <w:t xml:space="preserve"> Drei Bestände wurden systematisch und nicht stichprobenweise geprüft. Die Prüfung der Werbeeinbindung ergab 20 belegte Befunde, davon drei kontogefährdend. Dazu wurde jeder Befund in einem zweiten Durchgang gezielt angegriffen, um ihn zu widerlegen, und nur die dabei bestätigten Befunde stehen im Bericht. Bis zum 30.09.2026 wurden alle 20 Befunde behoben und mit den Testanzeigen von Google auf zwei Geräten und im Browser nachgeprüft. Die Oberfläche umfasst acht Sprachen mit inzwischen je 488 Texten. Bis zum 28.09.2026 wurde sie in jeder Sprache durchgesehen, damals mit je 404 Texten. Die 569 Vorschläge zur Erweiterung des Wortschatzes hat ein Muttersprachler am 26.09.2026 einzeln entschieden, dabei fielen zehn Dubletten mit falscher Schreibweise auf. Die Übersetzungen dieser Wörter wurden danach in jeder der sieben übrigen Sprachen als Ganzes gegengelesen.</w:t>
       </w:r>
     </w:p>
     <w:p>
@@ -20493,7 +22173,7 @@
           <w:sz w:val="22"/>
           <w:szCs w:val="22"/>
         </w:rPr>
-        <w:t xml:space="preserve">Die Abbildungen zeigen die Fassung, die den Testern ausgeliefert wurde, auf einem Android-Gerät. Dabei ist jede der fünf Übungsformen aus Abschnitt 2.3 einmal vertreten.</w:t>
+        <w:t xml:space="preserve">Die Abbildungen zeigen die App im Stand vom 01.10.2026. Aufgenommen wurden sie in einem Browser am PC, mit einem vorbereiteten Lernstand und in der Bildschirmbreite eines Telefons. Es sind dieselben acht Bilder, die für den Eintrag im Play Store erstellt wurden. Von den fünf Übungsformen aus Abschnitt 2.3 sind Auswählen und Lückentext zu sehen.</w:t>
       </w:r>
     </w:p>
     <w:tbl>
@@ -20591,7 +22271,7 @@
                 <w:sz w:val="16"/>
                 <w:szCs w:val="16"/>
               </w:rPr>
-              <w:t xml:space="preserve">Startseite</w:t>
+              <w:t xml:space="preserve">Startseite: Lernserie, Weitermachen, Tagesaufgaben</w:t>
             </w:r>
           </w:p>
         </w:tc>
@@ -20669,7 +22349,7 @@
                 <w:sz w:val="16"/>
                 <w:szCs w:val="16"/>
               </w:rPr>
-              <w:t xml:space="preserve">Lernpfad mit den vier Zuständen</w:t>
+              <w:t xml:space="preserve">Lernpfad: bestanden, jetzt dran, gesperrt</w:t>
             </w:r>
           </w:p>
         </w:tc>
@@ -20747,7 +22427,7 @@
                 <w:sz w:val="16"/>
                 <w:szCs w:val="16"/>
               </w:rPr>
-              <w:t xml:space="preserve">Abschnitt mit Fortschritt</w:t>
+              <w:t xml:space="preserve">Ein neues Wort</w:t>
             </w:r>
           </w:p>
         </w:tc>
@@ -20830,7 +22510,7 @@
                 <w:sz w:val="16"/>
                 <w:szCs w:val="16"/>
               </w:rPr>
-              <w:t xml:space="preserve">Ein neues Wort</w:t>
+              <w:t xml:space="preserve">Übungsform Auswählen</w:t>
             </w:r>
           </w:p>
         </w:tc>
@@ -20908,7 +22588,7 @@
                 <w:sz w:val="16"/>
                 <w:szCs w:val="16"/>
               </w:rPr>
-              <w:t xml:space="preserve">Übungsform Schreiben</w:t>
+              <w:t xml:space="preserve">Auswählen nach der richtigen Antwort</w:t>
             </w:r>
           </w:p>
         </w:tc>
@@ -20986,7 +22666,7 @@
                 <w:sz w:val="16"/>
                 <w:szCs w:val="16"/>
               </w:rPr>
-              <w:t xml:space="preserve">Übungsform Auswählen</w:t>
+              <w:t xml:space="preserve">Übungsform Lückentext</w:t>
             </w:r>
           </w:p>
         </w:tc>
@@ -21069,7 +22749,7 @@
                 <w:sz w:val="16"/>
                 <w:szCs w:val="16"/>
               </w:rPr>
-              <w:t xml:space="preserve">Übungsform Hören</w:t>
+              <w:t xml:space="preserve">Geschichte mit Übersetzung eines angetippten Worts</w:t>
             </w:r>
           </w:p>
         </w:tc>
@@ -21147,7 +22827,7 @@
                 <w:sz w:val="16"/>
                 <w:szCs w:val="16"/>
               </w:rPr>
-              <w:t xml:space="preserve">Übungsform Sprechen</w:t>
+              <w:t xml:space="preserve">Reiter Wiederholen</w:t>
             </w:r>
           </w:p>
         </w:tc>
@@ -21172,245 +22852,6 @@
               <w:spacing w:after="60"/>
               <w:jc w:val="center"/>
             </w:pPr>
-            <w:r>
-              <w:drawing>
-                <wp:inline distT="0" distB="0" distL="0" distR="0">
-                  <wp:extent cx="1352550" cy="2400300"/>
-                  <wp:effectExtent t="0" r="0" b="0" l="0"/>
-                  <wp:docPr id="1" name="" descr="" title=""/>
-                  <wp:cNvGraphicFramePr>
-                    <a:graphicFrameLocks xmlns:a="http://schemas.openxmlformats.org/drawingml/2006/main" noChangeAspect="1"/>
-                  </wp:cNvGraphicFramePr>
-                  <a:graphic xmlns:a="http://schemas.openxmlformats.org/drawingml/2006/main">
-                    <a:graphicData uri="http://schemas.openxmlformats.org/drawingml/2006/picture">
-                      <pic:pic xmlns:pic="http://schemas.openxmlformats.org/drawingml/2006/picture">
-                        <pic:nvPicPr>
-                          <pic:cNvPr id="0" name="" descr=""/>
-                          <pic:cNvPicPr>
-                            <a:picLocks noChangeAspect="1" noChangeArrowheads="1"/>
-                          </pic:cNvPicPr>
-                        </pic:nvPicPr>
-                        <pic:blipFill>
-                          <a:blip r:embed="rId18" cstate="none"/>
-                          <a:srcRect/>
-                          <a:stretch>
-                            <a:fillRect/>
-                          </a:stretch>
-                        </pic:blipFill>
-                        <pic:spPr bwMode="auto">
-                          <a:xfrm>
-                            <a:off x="0" y="0"/>
-                            <a:ext cx="1352550" cy="2400300"/>
-                          </a:xfrm>
-                          <a:prstGeom prst="rect">
-                            <a:avLst/>
-                          </a:prstGeom>
-                        </pic:spPr>
-                      </pic:pic>
-                    </a:graphicData>
-                  </a:graphic>
-                </wp:inline>
-              </w:drawing>
-            </w:r>
-          </w:p>
-          <w:p>
-            <w:pPr>
-              <w:spacing w:after="0"/>
-              <w:jc w:val="center"/>
-            </w:pPr>
-            <w:r>
-              <w:rPr>
-                <w:rFonts w:ascii="Calibri" w:cs="Calibri" w:eastAsia="Calibri" w:hAnsi="Calibri"/>
-                <w:color w:val="595959"/>
-                <w:sz w:val="16"/>
-                <w:szCs w:val="16"/>
-              </w:rPr>
-              <w:t xml:space="preserve">Übungsform Lückentext</w:t>
-            </w:r>
-          </w:p>
-        </w:tc>
-      </w:tr>
-      <w:tr>
-        <w:trPr>
-          <w:cantSplit/>
-        </w:trPr>
-        <w:tc>
-          <w:tcPr>
-            <w:tcW w:type="pct" w:w="33%"/>
-            <w:tcBorders>
-              <w:top w:val="none" w:color="FFFFFF" w:sz="0"/>
-              <w:left w:val="none" w:color="FFFFFF" w:sz="0"/>
-              <w:bottom w:val="none" w:color="FFFFFF" w:sz="0"/>
-              <w:right w:val="none" w:color="FFFFFF" w:sz="0"/>
-            </w:tcBorders>
-            <w:tcMar>
-              <w:top w:type="dxa" w:w="60"/>
-              <w:left w:type="dxa" w:w="70"/>
-              <w:bottom w:type="dxa" w:w="60"/>
-              <w:right w:type="dxa" w:w="70"/>
-            </w:tcMar>
-          </w:tcPr>
-          <w:p>
-            <w:pPr>
-              <w:spacing w:after="60"/>
-              <w:jc w:val="center"/>
-            </w:pPr>
-            <w:r>
-              <w:drawing>
-                <wp:inline distT="0" distB="0" distL="0" distR="0">
-                  <wp:extent cx="1352550" cy="2400300"/>
-                  <wp:effectExtent t="0" r="0" b="0" l="0"/>
-                  <wp:docPr id="1" name="" descr="" title=""/>
-                  <wp:cNvGraphicFramePr>
-                    <a:graphicFrameLocks xmlns:a="http://schemas.openxmlformats.org/drawingml/2006/main" noChangeAspect="1"/>
-                  </wp:cNvGraphicFramePr>
-                  <a:graphic xmlns:a="http://schemas.openxmlformats.org/drawingml/2006/main">
-                    <a:graphicData uri="http://schemas.openxmlformats.org/drawingml/2006/picture">
-                      <pic:pic xmlns:pic="http://schemas.openxmlformats.org/drawingml/2006/picture">
-                        <pic:nvPicPr>
-                          <pic:cNvPr id="0" name="" descr=""/>
-                          <pic:cNvPicPr>
-                            <a:picLocks noChangeAspect="1" noChangeArrowheads="1"/>
-                          </pic:cNvPicPr>
-                        </pic:nvPicPr>
-                        <pic:blipFill>
-                          <a:blip r:embed="rId19" cstate="none"/>
-                          <a:srcRect/>
-                          <a:stretch>
-                            <a:fillRect/>
-                          </a:stretch>
-                        </pic:blipFill>
-                        <pic:spPr bwMode="auto">
-                          <a:xfrm>
-                            <a:off x="0" y="0"/>
-                            <a:ext cx="1352550" cy="2400300"/>
-                          </a:xfrm>
-                          <a:prstGeom prst="rect">
-                            <a:avLst/>
-                          </a:prstGeom>
-                        </pic:spPr>
-                      </pic:pic>
-                    </a:graphicData>
-                  </a:graphic>
-                </wp:inline>
-              </w:drawing>
-            </w:r>
-          </w:p>
-          <w:p>
-            <w:pPr>
-              <w:spacing w:after="0"/>
-              <w:jc w:val="center"/>
-            </w:pPr>
-            <w:r>
-              <w:rPr>
-                <w:rFonts w:ascii="Calibri" w:cs="Calibri" w:eastAsia="Calibri" w:hAnsi="Calibri"/>
-                <w:color w:val="595959"/>
-                <w:sz w:val="16"/>
-                <w:szCs w:val="16"/>
-              </w:rPr>
-              <w:t xml:space="preserve">Der Laden: Ausstattung für das Maskottchen</w:t>
-            </w:r>
-          </w:p>
-        </w:tc>
-        <w:tc>
-          <w:tcPr>
-            <w:tcW w:type="pct" w:w="33%"/>
-            <w:tcBorders>
-              <w:top w:val="none" w:color="FFFFFF" w:sz="0"/>
-              <w:left w:val="none" w:color="FFFFFF" w:sz="0"/>
-              <w:bottom w:val="none" w:color="FFFFFF" w:sz="0"/>
-              <w:right w:val="none" w:color="FFFFFF" w:sz="0"/>
-            </w:tcBorders>
-            <w:tcMar>
-              <w:top w:type="dxa" w:w="60"/>
-              <w:left w:type="dxa" w:w="70"/>
-              <w:bottom w:type="dxa" w:w="60"/>
-              <w:right w:type="dxa" w:w="70"/>
-            </w:tcMar>
-          </w:tcPr>
-          <w:p>
-            <w:pPr>
-              <w:spacing w:after="60"/>
-              <w:jc w:val="center"/>
-            </w:pPr>
-            <w:r>
-              <w:drawing>
-                <wp:inline distT="0" distB="0" distL="0" distR="0">
-                  <wp:extent cx="1352550" cy="2400300"/>
-                  <wp:effectExtent t="0" r="0" b="0" l="0"/>
-                  <wp:docPr id="1" name="" descr="" title=""/>
-                  <wp:cNvGraphicFramePr>
-                    <a:graphicFrameLocks xmlns:a="http://schemas.openxmlformats.org/drawingml/2006/main" noChangeAspect="1"/>
-                  </wp:cNvGraphicFramePr>
-                  <a:graphic xmlns:a="http://schemas.openxmlformats.org/drawingml/2006/main">
-                    <a:graphicData uri="http://schemas.openxmlformats.org/drawingml/2006/picture">
-                      <pic:pic xmlns:pic="http://schemas.openxmlformats.org/drawingml/2006/picture">
-                        <pic:nvPicPr>
-                          <pic:cNvPr id="0" name="" descr=""/>
-                          <pic:cNvPicPr>
-                            <a:picLocks noChangeAspect="1" noChangeArrowheads="1"/>
-                          </pic:cNvPicPr>
-                        </pic:nvPicPr>
-                        <pic:blipFill>
-                          <a:blip r:embed="rId20" cstate="none"/>
-                          <a:srcRect/>
-                          <a:stretch>
-                            <a:fillRect/>
-                          </a:stretch>
-                        </pic:blipFill>
-                        <pic:spPr bwMode="auto">
-                          <a:xfrm>
-                            <a:off x="0" y="0"/>
-                            <a:ext cx="1352550" cy="2400300"/>
-                          </a:xfrm>
-                          <a:prstGeom prst="rect">
-                            <a:avLst/>
-                          </a:prstGeom>
-                        </pic:spPr>
-                      </pic:pic>
-                    </a:graphicData>
-                  </a:graphic>
-                </wp:inline>
-              </w:drawing>
-            </w:r>
-          </w:p>
-          <w:p>
-            <w:pPr>
-              <w:spacing w:after="0"/>
-              <w:jc w:val="center"/>
-            </w:pPr>
-            <w:r>
-              <w:rPr>
-                <w:rFonts w:ascii="Calibri" w:cs="Calibri" w:eastAsia="Calibri" w:hAnsi="Calibri"/>
-                <w:color w:val="595959"/>
-                <w:sz w:val="16"/>
-                <w:szCs w:val="16"/>
-              </w:rPr>
-              <w:t xml:space="preserve">Der Laden: Leben auffüllen, Serienschutz</w:t>
-            </w:r>
-          </w:p>
-        </w:tc>
-        <w:tc>
-          <w:tcPr>
-            <w:tcW w:type="pct" w:w="33%"/>
-            <w:tcBorders>
-              <w:top w:val="none" w:color="FFFFFF" w:sz="0"/>
-              <w:left w:val="none" w:color="FFFFFF" w:sz="0"/>
-              <w:bottom w:val="none" w:color="FFFFFF" w:sz="0"/>
-              <w:right w:val="none" w:color="FFFFFF" w:sz="0"/>
-            </w:tcBorders>
-            <w:tcMar>
-              <w:top w:type="dxa" w:w="60"/>
-              <w:left w:type="dxa" w:w="70"/>
-              <w:bottom w:type="dxa" w:w="60"/>
-              <w:right w:type="dxa" w:w="70"/>
-            </w:tcMar>
-          </w:tcPr>
-          <w:p>
-            <w:pPr>
-              <w:spacing w:after="60"/>
-              <w:jc w:val="center"/>
-            </w:pPr>
           </w:p>
           <w:p>
             <w:pPr>
@@ -21466,7 +22907,7 @@
           <w:sz w:val="22"/>
           <w:szCs w:val="22"/>
         </w:rPr>
-        <w:t xml:space="preserve">Nachfolgend sind drei Stellen abgedruckt, auf die sich Kapitel 5 stützt. Die Zeilenumbrüche sind für den Abdruck gesetzt worden, am Inhalt selbst wurde nichts geändert.</w:t>
+        <w:t xml:space="preserve">Nachfolgend sind drei Stellen abgedruckt, auf die sich Kapitel 5 stützt. Zeilenumbrüche und Leerzeichen sind für den Abdruck gesetzt worden. Im ersten Auszug sind zusätzlich Erläuterungen hinter // ergänzt und zwei Klammerpaare ohne Wirkung weggelassen. Außerdem fehlen dort vier Zeilen, in denen Symbol, Beschriftung und Fortschrittsbalken eines Eintrags im Lernpfad entstehen. Am Ergebnis der abgedruckten Ausdrücke ändert das nichts.</w:t>
       </w:r>
     </w:p>
     <w:p>
@@ -21693,7 +23134,7 @@
           <w:sz w:val="16"/>
           <w:szCs w:val="16"/>
         </w:rPr>
-        <w:t xml:space="preserve">web/index.html, Zeilen 3892 bis 3898</w:t>
+        <w:t xml:space="preserve">web/index.html, Zeilen 6091 bis 6097</w:t>
       </w:r>
     </w:p>
     <w:p>
@@ -21845,7 +23286,7 @@
           <w:sz w:val="15"/>
           <w:szCs w:val="15"/>
         </w:rPr>
-        <w:t xml:space="preserve">             standUebernehmen. Steht es nur hier, faellt es beim</w:t>
+        <w:t xml:space="preserve">             standUebernehmen. Steht es nur hier, fällt es beim</w:t>
       </w:r>
     </w:p>
     <w:p>
@@ -21890,7 +23331,172 @@
           <w:sz w:val="15"/>
           <w:szCs w:val="15"/>
         </w:rPr>
-        <w:t xml:space="preserve">          gefeiert:[...gefeiert], rekord:rekord, wann:wann};</w:t>
+        <w:t xml:space="preserve">          gefeiert:[...gefeiert], rekord:rekord, wann:wann,</w:t>
+      </w:r>
+    </w:p>
+    <w:p>
+      <w:pPr>
+        <w:keepNext/>
+        <w:shd w:fill="F4F6FA"/>
+        <w:spacing w:after="0" w:line="230"/>
+      </w:pPr>
+      <w:r>
+        <w:rPr>
+          <w:rFonts w:ascii="Consolas" w:cs="Consolas" w:eastAsia="Consolas" w:hAnsi="Consolas"/>
+          <w:sz w:val="15"/>
+          <w:szCs w:val="15"/>
+        </w:rPr>
+        <w:t xml:space="preserve">          /* Nur das Jahr des letzten Geschenks, nie die laufende Frist.</w:t>
+      </w:r>
+    </w:p>
+    <w:p>
+      <w:pPr>
+        <w:keepNext/>
+        <w:shd w:fill="F4F6FA"/>
+        <w:spacing w:after="0" w:line="230"/>
+      </w:pPr>
+      <w:r>
+        <w:rPr>
+          <w:rFonts w:ascii="Consolas" w:cs="Consolas" w:eastAsia="Consolas" w:hAnsi="Consolas"/>
+          <w:sz w:val="15"/>
+          <w:szCs w:val="15"/>
+        </w:rPr>
+        <w:t xml:space="preserve">             Das Jahr sagt "dieses Geschenk wurde schon gegeben" und gehoert</w:t>
+      </w:r>
+    </w:p>
+    <w:p>
+      <w:pPr>
+        <w:keepNext/>
+        <w:shd w:fill="F4F6FA"/>
+        <w:spacing w:after="0" w:line="230"/>
+      </w:pPr>
+      <w:r>
+        <w:rPr>
+          <w:rFonts w:ascii="Consolas" w:cs="Consolas" w:eastAsia="Consolas" w:hAnsi="Consolas"/>
+          <w:sz w:val="15"/>
+          <w:szCs w:val="15"/>
+        </w:rPr>
+        <w:t xml:space="preserve">             damit zum Lernenden, nicht zum Geraet: lag es nur im</w:t>
+      </w:r>
+    </w:p>
+    <w:p>
+      <w:pPr>
+        <w:keepNext/>
+        <w:shd w:fill="F4F6FA"/>
+        <w:spacing w:after="0" w:line="230"/>
+      </w:pPr>
+      <w:r>
+        <w:rPr>
+          <w:rFonts w:ascii="Consolas" w:cs="Consolas" w:eastAsia="Consolas" w:hAnsi="Consolas"/>
+          <w:sz w:val="15"/>
+          <w:szCs w:val="15"/>
+        </w:rPr>
+        <w:t xml:space="preserve">             Geraetespeicher, holte man sich die fuenf Tage beliebig oft -</w:t>
+      </w:r>
+    </w:p>
+    <w:p>
+      <w:pPr>
+        <w:keepNext/>
+        <w:shd w:fill="F4F6FA"/>
+        <w:spacing w:after="0" w:line="230"/>
+      </w:pPr>
+      <w:r>
+        <w:rPr>
+          <w:rFonts w:ascii="Consolas" w:cs="Consolas" w:eastAsia="Consolas" w:hAnsi="Consolas"/>
+          <w:sz w:val="15"/>
+          <w:szCs w:val="15"/>
+        </w:rPr>
+        <w:t xml:space="preserve">             App-Daten loeschen, Sicherung einlesen, wieder faellig. Die</w:t>
+      </w:r>
+    </w:p>
+    <w:p>
+      <w:pPr>
+        <w:keepNext/>
+        <w:shd w:fill="F4F6FA"/>
+        <w:spacing w:after="0" w:line="230"/>
+      </w:pPr>
+      <w:r>
+        <w:rPr>
+          <w:rFonts w:ascii="Consolas" w:cs="Consolas" w:eastAsia="Consolas" w:hAnsi="Consolas"/>
+          <w:sz w:val="15"/>
+          <w:szCs w:val="15"/>
+        </w:rPr>
+        <w:t xml:space="preserve">             Frist bleibt draussen, sonst waeren laufende Geschenktage</w:t>
+      </w:r>
+    </w:p>
+    <w:p>
+      <w:pPr>
+        <w:keepNext/>
+        <w:shd w:fill="F4F6FA"/>
+        <w:spacing w:after="0" w:line="230"/>
+      </w:pPr>
+      <w:r>
+        <w:rPr>
+          <w:rFonts w:ascii="Consolas" w:cs="Consolas" w:eastAsia="Consolas" w:hAnsi="Consolas"/>
+          <w:sz w:val="15"/>
+          <w:szCs w:val="15"/>
+        </w:rPr>
+        <w:t xml:space="preserve">             verschenkbar. Gefunden in der Gegenpruefung am 29.09.2026. */</w:t>
+      </w:r>
+    </w:p>
+    <w:p>
+      <w:pPr>
+        <w:keepNext/>
+        <w:shd w:fill="F4F6FA"/>
+        <w:spacing w:after="0" w:line="230"/>
+      </w:pPr>
+      <w:r>
+        <w:rPr>
+          <w:rFonts w:ascii="Consolas" w:cs="Consolas" w:eastAsia="Consolas" w:hAnsi="Consolas"/>
+          <w:sz w:val="15"/>
+          <w:szCs w:val="15"/>
+        </w:rPr>
+        <w:t xml:space="preserve">          geschenk_jahr: (geschenk.jahr || 0),</w:t>
+      </w:r>
+    </w:p>
+    <w:p>
+      <w:pPr>
+        <w:keepNext/>
+        <w:shd w:fill="F4F6FA"/>
+        <w:spacing w:after="0" w:line="230"/>
+      </w:pPr>
+      <w:r>
+        <w:rPr>
+          <w:rFonts w:ascii="Consolas" w:cs="Consolas" w:eastAsia="Consolas" w:hAnsi="Consolas"/>
+          <w:sz w:val="15"/>
+          <w:szCs w:val="15"/>
+        </w:rPr>
+        <w:t xml:space="preserve">          /* Beide gehoeren zum Lernenden und muessen mit auf ein neues</w:t>
+      </w:r>
+    </w:p>
+    <w:p>
+      <w:pPr>
+        <w:keepNext/>
+        <w:shd w:fill="F4F6FA"/>
+        <w:spacing w:after="0" w:line="230"/>
+      </w:pPr>
+      <w:r>
+        <w:rPr>
+          <w:rFonts w:ascii="Consolas" w:cs="Consolas" w:eastAsia="Consolas" w:hAnsi="Consolas"/>
+          <w:sz w:val="15"/>
+          <w:szCs w:val="15"/>
+        </w:rPr>
+        <w:t xml:space="preserve">             Handy - die Einstufung haelt die uebersprungenen Level offen. */</w:t>
+      </w:r>
+    </w:p>
+    <w:p>
+      <w:pPr>
+        <w:keepNext/>
+        <w:shd w:fill="F4F6FA"/>
+        <w:spacing w:after="0" w:line="230"/>
+      </w:pPr>
+      <w:r>
+        <w:rPr>
+          <w:rFonts w:ascii="Consolas" w:cs="Consolas" w:eastAsia="Consolas" w:hAnsi="Consolas"/>
+          <w:sz w:val="15"/>
+          <w:szCs w:val="15"/>
+        </w:rPr>
+        <w:t xml:space="preserve">          einstufung: einstufung, topf: topf, bewertung: bewertung};</w:t>
       </w:r>
     </w:p>
     <w:p>
@@ -21921,7 +23527,7 @@
           <w:sz w:val="16"/>
           <w:szCs w:val="16"/>
         </w:rPr>
-        <w:t xml:space="preserve">web/index.html, Zeilen 2066 bis 2075</w:t>
+        <w:t xml:space="preserve">web/index.html, Zeilen 3599 bis 3619</w:t>
       </w:r>
     </w:p>
     <w:p>
@@ -21937,7 +23543,7 @@
           <w:sz w:val="22"/>
           <w:szCs w:val="22"/>
         </w:rPr>
-        <w:t xml:space="preserve">Der Vermerk im Quelltext ist die Folge eines Fehlers. Ein Feld war nur beim Speichern eingetragen und nicht beim Einlesen, sodass es beim Gerätewechsel verloren ging, ohne dass eine Meldung darauf hinwies.</w:t>
+        <w:t xml:space="preserve">Der erste Vermerk im Quelltext ist die Folge eines Fehlers. Ein Feld war nur beim Speichern eingetragen und nicht beim Einlesen, sodass es beim Gerätewechsel verloren ging, ohne dass eine Meldung darauf hinwies. Der zweite Vermerk hält einen Befund der Gegenprüfung vom 29.09.2026 fest. Wer die App seit einem Jahr nutzt, bekommt fünf Tage ohne Werbung und mit unbegrenzten Leben geschenkt. Da das Jahr dieses Geschenks bis dahin nur im Gerätespeicher lag, ließen sich die fünf Tage durch Löschen der App-Daten und Einlesen einer Sicherung beliebig oft abholen.</w:t>
       </w:r>
     </w:p>
     <w:p>
@@ -22043,7 +23649,7 @@
           <w:sz w:val="15"/>
           <w:szCs w:val="15"/>
         </w:rPr>
-        <w:t xml:space="preserve"> </w:t>
+        <w:t xml:space="preserve">    print("ok   %s" % name)</w:t>
       </w:r>
     </w:p>
     <w:p>
@@ -22058,7 +23664,22 @@
           <w:sz w:val="15"/>
           <w:szCs w:val="15"/>
         </w:rPr>
-        <w:t xml:space="preserve"># ----------------------------------------------- Nachkontrolle</w:t>
+        <w:t xml:space="preserve"> </w:t>
+      </w:r>
+    </w:p>
+    <w:p>
+      <w:pPr>
+        <w:keepNext/>
+        <w:shd w:fill="F4F6FA"/>
+        <w:spacing w:after="0" w:line="230"/>
+      </w:pPr>
+      <w:r>
+        <w:rPr>
+          <w:rFonts w:ascii="Consolas" w:cs="Consolas" w:eastAsia="Consolas" w:hAnsi="Consolas"/>
+          <w:sz w:val="15"/>
+          <w:szCs w:val="15"/>
+        </w:rPr>
+        <w:t xml:space="preserve"># ------------------------------------------------------------ Nachkontrolle</w:t>
       </w:r>
     </w:p>
     <w:p>
@@ -22179,7 +23800,7 @@
           <w:sz w:val="16"/>
           <w:szCs w:val="16"/>
         </w:rPr>
-        <w:t xml:space="preserve">vorspann_richten.py, Zeilen 111 bis 125</w:t>
+        <w:t xml:space="preserve">vorspann_richten.py, Zeilen 117 bis 131</w:t>
       </w:r>
     </w:p>
     <w:p>
@@ -22293,6 +23914,69 @@
                 <w:szCs w:val="18"/>
               </w:rPr>
               <w:t xml:space="preserve">Bedeutung</w:t>
+            </w:r>
+          </w:p>
+        </w:tc>
+      </w:tr>
+      <w:tr>
+        <w:trPr>
+          <w:cantSplit/>
+        </w:trPr>
+        <w:tc>
+          <w:tcPr>
+            <w:tcW w:type="pct" w:w="24%"/>
+            <w:tcMar>
+              <w:top w:type="dxa" w:w="60"/>
+              <w:left w:type="dxa" w:w="90"/>
+              <w:bottom w:type="dxa" w:w="60"/>
+              <w:right w:type="dxa" w:w="90"/>
+            </w:tcMar>
+            <w:vAlign w:val="center"/>
+          </w:tcPr>
+          <w:p>
+            <w:pPr>
+              <w:spacing w:after="0" w:line="240"/>
+              <w:jc w:val="left"/>
+            </w:pPr>
+            <w:r>
+              <w:rPr>
+                <w:rFonts w:ascii="Calibri" w:cs="Calibri" w:eastAsia="Calibri" w:hAnsi="Calibri"/>
+                <w:b w:val="false"/>
+                <w:bCs w:val="false"/>
+                <w:color w:val="000000"/>
+                <w:sz w:val="18"/>
+                <w:szCs w:val="18"/>
+              </w:rPr>
+              <w:t xml:space="preserve">AdMob</w:t>
+            </w:r>
+          </w:p>
+        </w:tc>
+        <w:tc>
+          <w:tcPr>
+            <w:tcW w:type="pct" w:w="76%"/>
+            <w:tcMar>
+              <w:top w:type="dxa" w:w="60"/>
+              <w:left w:type="dxa" w:w="90"/>
+              <w:bottom w:type="dxa" w:w="60"/>
+              <w:right w:type="dxa" w:w="90"/>
+            </w:tcMar>
+            <w:vAlign w:val="center"/>
+          </w:tcPr>
+          <w:p>
+            <w:pPr>
+              <w:spacing w:after="0" w:line="240"/>
+              <w:jc w:val="left"/>
+            </w:pPr>
+            <w:r>
+              <w:rPr>
+                <w:rFonts w:ascii="Calibri" w:cs="Calibri" w:eastAsia="Calibri" w:hAnsi="Calibri"/>
+                <w:b w:val="false"/>
+                <w:bCs w:val="false"/>
+                <w:color w:val="000000"/>
+                <w:sz w:val="18"/>
+                <w:szCs w:val="18"/>
+              </w:rPr>
+              <w:t xml:space="preserve">Werbenetzwerk von Google, über das die App ihre Anzeigen bezieht</w:t>
             </w:r>
           </w:p>
         </w:tc>
@@ -23359,7 +25043,7 @@
         <w:sz w:val="18"/>
         <w:szCs w:val="18"/>
       </w:rPr>
-      <w:t xml:space="preserve">Stand: 26.09.2026</w:t>
+      <w:t xml:space="preserve">Stand: 02.10.2026</w:t>
     </w:r>
     <w:r>
       <w:rPr>

</xml_diff>